<commit_message>
edited report template, added headings
</commit_message>
<xml_diff>
--- a/report/Group_Assignment_2_2559273_2559274.docx
+++ b/report/Group_Assignment_2_2559273_2559274.docx
@@ -21,27 +21,74 @@
           <w:szCs w:val="32"/>
           <w:lang w:val="en-US"/>
         </w:rPr>
-        <w:t>Group Assignment 1</w:t>
+        <w:t xml:space="preserve">Group Assignment </w:t>
+      </w:r>
+      <w:r>
+        <w:rPr>
+          <w:rFonts w:asciiTheme="minorEastAsia" w:hAnsiTheme="minorEastAsia"/>
+          <w:b/>
+          <w:sz w:val="32"/>
+          <w:szCs w:val="32"/>
+          <w:lang w:val="en-US"/>
+        </w:rPr>
+        <w:t>2: Pair Coding</w:t>
+      </w:r>
+    </w:p>
+    <w:p>
+      <w:pPr>
+        <w:rPr>
+          <w:rFonts w:asciiTheme="minorEastAsia" w:hAnsiTheme="minorEastAsia"/>
+          <w:lang w:val="en-US"/>
+        </w:rPr>
+      </w:pPr>
+    </w:p>
+    <w:p>
+      <w:pPr>
+        <w:pStyle w:val="Listenabsatz"/>
+        <w:numPr>
+          <w:ilvl w:val="0"/>
+          <w:numId w:val="1"/>
+        </w:numPr>
+        <w:rPr>
+          <w:rFonts w:asciiTheme="minorEastAsia" w:hAnsiTheme="minorEastAsia"/>
+          <w:b/>
+          <w:lang w:val="en-US"/>
+        </w:rPr>
+      </w:pPr>
+      <w:r>
+        <w:rPr>
+          <w:rFonts w:asciiTheme="minorEastAsia" w:hAnsiTheme="minorEastAsia"/>
+          <w:b/>
+          <w:lang w:val="en-US"/>
+        </w:rPr>
+        <w:t>Teammate</w:t>
+      </w:r>
+      <w:r>
+        <w:rPr>
+          <w:rFonts w:asciiTheme="minorEastAsia" w:hAnsiTheme="minorEastAsia"/>
+          <w:b/>
+          <w:lang w:val="en-US"/>
+        </w:rPr>
+        <w:t>s</w:t>
       </w:r>
     </w:p>
     <w:tbl>
       <w:tblPr>
         <w:tblStyle w:val="Tabellenraster"/>
-        <w:tblW w:w="0" w:type="auto"/>
+        <w:tblW w:w="5000" w:type="pct"/>
         <w:tblLook w:val="04A0" w:firstRow="1" w:lastRow="0" w:firstColumn="1" w:lastColumn="0" w:noHBand="0" w:noVBand="1"/>
       </w:tblPr>
       <w:tblGrid>
-        <w:gridCol w:w="1356"/>
-        <w:gridCol w:w="1334"/>
-        <w:gridCol w:w="1390"/>
-        <w:gridCol w:w="1534"/>
-        <w:gridCol w:w="1137"/>
-        <w:gridCol w:w="2311"/>
+        <w:gridCol w:w="1270"/>
+        <w:gridCol w:w="1858"/>
+        <w:gridCol w:w="1403"/>
+        <w:gridCol w:w="1995"/>
+        <w:gridCol w:w="2536"/>
       </w:tblGrid>
       <w:tr>
         <w:tc>
           <w:tcPr>
-            <w:tcW w:w="1535" w:type="dxa"/>
+            <w:tcW w:w="701" w:type="pct"/>
           </w:tcPr>
           <w:p>
             <w:pPr>
@@ -63,7 +110,7 @@
         </w:tc>
         <w:tc>
           <w:tcPr>
-            <w:tcW w:w="1537" w:type="dxa"/>
+            <w:tcW w:w="1025" w:type="pct"/>
           </w:tcPr>
           <w:p>
             <w:pPr>
@@ -85,7 +132,7 @@
         </w:tc>
         <w:tc>
           <w:tcPr>
-            <w:tcW w:w="1588" w:type="dxa"/>
+            <w:tcW w:w="774" w:type="pct"/>
           </w:tcPr>
           <w:p>
             <w:pPr>
@@ -107,7 +154,7 @@
         </w:tc>
         <w:tc>
           <w:tcPr>
-            <w:tcW w:w="1676" w:type="dxa"/>
+            <w:tcW w:w="1101" w:type="pct"/>
           </w:tcPr>
           <w:p>
             <w:pPr>
@@ -123,35 +170,13 @@
                 <w:i/>
                 <w:lang w:val="en-US"/>
               </w:rPr>
-              <w:t>Nationality</w:t>
-            </w:r>
-          </w:p>
-        </w:tc>
-        <w:tc>
-          <w:tcPr>
-            <w:tcW w:w="1363" w:type="dxa"/>
-          </w:tcPr>
-          <w:p>
-            <w:pPr>
-              <w:rPr>
-                <w:rFonts w:asciiTheme="minorEastAsia" w:hAnsiTheme="minorEastAsia"/>
-                <w:i/>
-                <w:lang w:val="en-US"/>
-              </w:rPr>
-            </w:pPr>
-            <w:r>
-              <w:rPr>
-                <w:rFonts w:asciiTheme="minorEastAsia" w:hAnsiTheme="minorEastAsia"/>
-                <w:i/>
-                <w:lang w:val="en-US"/>
-              </w:rPr>
-              <w:t>Sex</w:t>
-            </w:r>
-          </w:p>
-        </w:tc>
-        <w:tc>
-          <w:tcPr>
-            <w:tcW w:w="1363" w:type="dxa"/>
+              <w:t>Responsibility (%)</w:t>
+            </w:r>
+          </w:p>
+        </w:tc>
+        <w:tc>
+          <w:tcPr>
+            <w:tcW w:w="1399" w:type="pct"/>
           </w:tcPr>
           <w:p>
             <w:pPr>
@@ -175,7 +200,7 @@
       <w:tr>
         <w:tc>
           <w:tcPr>
-            <w:tcW w:w="1535" w:type="dxa"/>
+            <w:tcW w:w="701" w:type="pct"/>
           </w:tcPr>
           <w:p>
             <w:pPr>
@@ -236,7 +261,7 @@
         </w:tc>
         <w:tc>
           <w:tcPr>
-            <w:tcW w:w="1537" w:type="dxa"/>
+            <w:tcW w:w="1025" w:type="pct"/>
           </w:tcPr>
           <w:p>
             <w:pPr>
@@ -271,7 +296,7 @@
         </w:tc>
         <w:tc>
           <w:tcPr>
-            <w:tcW w:w="1588" w:type="dxa"/>
+            <w:tcW w:w="774" w:type="pct"/>
           </w:tcPr>
           <w:p>
             <w:pPr>
@@ -291,77 +316,28 @@
         </w:tc>
         <w:tc>
           <w:tcPr>
-            <w:tcW w:w="1676" w:type="dxa"/>
-          </w:tcPr>
-          <w:p>
-            <w:pPr>
-              <w:rPr>
-                <w:rFonts w:asciiTheme="minorEastAsia" w:hAnsiTheme="minorEastAsia"/>
-                <w:lang w:val="en-US"/>
-              </w:rPr>
-            </w:pPr>
-            <w:r>
-              <w:rPr>
-                <w:rFonts w:asciiTheme="minorEastAsia" w:hAnsiTheme="minorEastAsia"/>
-                <w:lang w:val="en-US"/>
-              </w:rPr>
-              <w:t>GERMAN</w:t>
-            </w:r>
-          </w:p>
-          <w:p>
-            <w:pPr>
-              <w:rPr>
-                <w:rFonts w:asciiTheme="minorEastAsia" w:hAnsiTheme="minorEastAsia"/>
-                <w:lang w:val="en-US"/>
-              </w:rPr>
-            </w:pPr>
-            <w:r>
-              <w:rPr>
-                <w:rFonts w:asciiTheme="minorEastAsia" w:hAnsiTheme="minorEastAsia"/>
-                <w:lang w:val="en-US"/>
-              </w:rPr>
-              <w:t>德国</w:t>
-            </w:r>
-          </w:p>
-        </w:tc>
-        <w:tc>
-          <w:tcPr>
-            <w:tcW w:w="1363" w:type="dxa"/>
-          </w:tcPr>
-          <w:p>
-            <w:pPr>
-              <w:rPr>
-                <w:rFonts w:asciiTheme="minorEastAsia" w:hAnsiTheme="minorEastAsia"/>
-                <w:lang w:val="en-US"/>
-              </w:rPr>
-            </w:pPr>
-            <w:r>
-              <w:rPr>
-                <w:rFonts w:asciiTheme="minorEastAsia" w:hAnsiTheme="minorEastAsia"/>
-                <w:lang w:val="en-US"/>
-              </w:rPr>
-              <w:t>MALE</w:t>
-            </w:r>
-          </w:p>
-          <w:p>
-            <w:pPr>
-              <w:rPr>
-                <w:rFonts w:asciiTheme="minorEastAsia" w:hAnsiTheme="minorEastAsia"/>
-                <w:lang w:val="en-US"/>
-              </w:rPr>
-            </w:pPr>
-            <w:r>
-              <w:rPr>
-                <w:rFonts w:asciiTheme="minorEastAsia" w:hAnsiTheme="minorEastAsia"/>
-                <w:lang w:val="en-US"/>
-              </w:rPr>
-              <w:t>男</w:t>
-            </w:r>
-          </w:p>
-        </w:tc>
-        <w:tc>
-          <w:tcPr>
-            <w:tcW w:w="1363" w:type="dxa"/>
+            <w:tcW w:w="1101" w:type="pct"/>
+          </w:tcPr>
+          <w:p>
+            <w:pPr>
+              <w:jc w:val="right"/>
+              <w:rPr>
+                <w:rFonts w:asciiTheme="minorEastAsia" w:hAnsiTheme="minorEastAsia"/>
+                <w:lang w:val="en-US"/>
+              </w:rPr>
+            </w:pPr>
+            <w:r>
+              <w:rPr>
+                <w:rFonts w:asciiTheme="minorEastAsia" w:hAnsiTheme="minorEastAsia"/>
+                <w:lang w:val="en-US"/>
+              </w:rPr>
+              <w:t>50</w:t>
+            </w:r>
+          </w:p>
+        </w:tc>
+        <w:tc>
+          <w:tcPr>
+            <w:tcW w:w="1399" w:type="pct"/>
           </w:tcPr>
           <w:p>
             <w:pPr>
@@ -386,7 +362,7 @@
       <w:tr>
         <w:tc>
           <w:tcPr>
-            <w:tcW w:w="1535" w:type="dxa"/>
+            <w:tcW w:w="701" w:type="pct"/>
           </w:tcPr>
           <w:p>
             <w:pPr>
@@ -447,7 +423,7 @@
         </w:tc>
         <w:tc>
           <w:tcPr>
-            <w:tcW w:w="1537" w:type="dxa"/>
+            <w:tcW w:w="1025" w:type="pct"/>
           </w:tcPr>
           <w:p>
             <w:pPr>
@@ -482,7 +458,7 @@
         </w:tc>
         <w:tc>
           <w:tcPr>
-            <w:tcW w:w="1588" w:type="dxa"/>
+            <w:tcW w:w="774" w:type="pct"/>
           </w:tcPr>
           <w:p>
             <w:pPr>
@@ -502,77 +478,28 @@
         </w:tc>
         <w:tc>
           <w:tcPr>
-            <w:tcW w:w="1676" w:type="dxa"/>
-          </w:tcPr>
-          <w:p>
-            <w:pPr>
-              <w:rPr>
-                <w:rFonts w:asciiTheme="minorEastAsia" w:hAnsiTheme="minorEastAsia"/>
-                <w:lang w:val="en-US"/>
-              </w:rPr>
-            </w:pPr>
-            <w:r>
-              <w:rPr>
-                <w:rFonts w:asciiTheme="minorEastAsia" w:hAnsiTheme="minorEastAsia"/>
-                <w:lang w:val="en-US"/>
-              </w:rPr>
-              <w:t>GERMAN</w:t>
-            </w:r>
-          </w:p>
-          <w:p>
-            <w:pPr>
-              <w:rPr>
-                <w:rFonts w:asciiTheme="minorEastAsia" w:hAnsiTheme="minorEastAsia"/>
-                <w:lang w:val="en-US"/>
-              </w:rPr>
-            </w:pPr>
-            <w:r>
-              <w:rPr>
-                <w:rFonts w:asciiTheme="minorEastAsia" w:hAnsiTheme="minorEastAsia"/>
-                <w:lang w:val="en-US"/>
-              </w:rPr>
-              <w:t>德国</w:t>
-            </w:r>
-          </w:p>
-        </w:tc>
-        <w:tc>
-          <w:tcPr>
-            <w:tcW w:w="1363" w:type="dxa"/>
-          </w:tcPr>
-          <w:p>
-            <w:pPr>
-              <w:rPr>
-                <w:rFonts w:asciiTheme="minorEastAsia" w:hAnsiTheme="minorEastAsia"/>
-                <w:lang w:val="en-US"/>
-              </w:rPr>
-            </w:pPr>
-            <w:r>
-              <w:rPr>
-                <w:rFonts w:asciiTheme="minorEastAsia" w:hAnsiTheme="minorEastAsia"/>
-                <w:lang w:val="en-US"/>
-              </w:rPr>
-              <w:t>MALE</w:t>
-            </w:r>
-          </w:p>
-          <w:p>
-            <w:pPr>
-              <w:rPr>
-                <w:rFonts w:asciiTheme="minorEastAsia" w:hAnsiTheme="minorEastAsia"/>
-                <w:lang w:val="en-US"/>
-              </w:rPr>
-            </w:pPr>
-            <w:r>
-              <w:rPr>
-                <w:rFonts w:asciiTheme="minorEastAsia" w:hAnsiTheme="minorEastAsia"/>
-                <w:lang w:val="en-US"/>
-              </w:rPr>
-              <w:t>男</w:t>
-            </w:r>
-          </w:p>
-        </w:tc>
-        <w:tc>
-          <w:tcPr>
-            <w:tcW w:w="1363" w:type="dxa"/>
+            <w:tcW w:w="1101" w:type="pct"/>
+          </w:tcPr>
+          <w:p>
+            <w:pPr>
+              <w:jc w:val="right"/>
+              <w:rPr>
+                <w:rFonts w:asciiTheme="minorEastAsia" w:hAnsiTheme="minorEastAsia"/>
+                <w:lang w:val="en-US"/>
+              </w:rPr>
+            </w:pPr>
+            <w:r>
+              <w:rPr>
+                <w:rFonts w:asciiTheme="minorEastAsia" w:hAnsiTheme="minorEastAsia"/>
+                <w:lang w:val="en-US"/>
+              </w:rPr>
+              <w:t>50</w:t>
+            </w:r>
+          </w:p>
+        </w:tc>
+        <w:tc>
+          <w:tcPr>
+            <w:tcW w:w="1399" w:type="pct"/>
           </w:tcPr>
           <w:p>
             <w:pPr>
@@ -606,6 +533,7 @@
       <w:pPr>
         <w:rPr>
           <w:rFonts w:asciiTheme="minorEastAsia" w:hAnsiTheme="minorEastAsia"/>
+          <w:b/>
           <w:lang w:val="en-US"/>
         </w:rPr>
       </w:pPr>
@@ -626,6 +554,7 @@
       <w:r>
         <w:rPr>
           <w:rFonts w:asciiTheme="minorEastAsia" w:hAnsiTheme="minorEastAsia"/>
+          <w:b/>
           <w:noProof/>
           <w:lang w:val="en-US"/>
         </w:rPr>
@@ -698,9 +627,28 @@
         <w:rPr>
           <w:rFonts w:asciiTheme="minorEastAsia" w:hAnsiTheme="minorEastAsia"/>
           <w:b/>
-          <w:lang w:val="en-US"/>
-        </w:rPr>
-        <w:t>A photo of your group</w:t>
+          <w:noProof/>
+          <w:lang w:val="en-US"/>
+        </w:rPr>
+        <w:t xml:space="preserve">A </w:t>
+      </w:r>
+      <w:r>
+        <w:rPr>
+          <w:rFonts w:asciiTheme="minorEastAsia" w:hAnsiTheme="minorEastAsia"/>
+          <w:b/>
+          <w:noProof/>
+          <w:lang w:val="en-US"/>
+        </w:rPr>
+        <w:t>photo</w:t>
+      </w:r>
+      <w:r>
+        <w:rPr>
+          <w:rFonts w:asciiTheme="minorEastAsia" w:hAnsiTheme="minorEastAsia"/>
+          <w:b/>
+          <w:noProof/>
+          <w:lang w:val="en-US"/>
+        </w:rPr>
+        <w:t xml:space="preserve"> of your pair programming.</w:t>
       </w:r>
     </w:p>
     <w:p>
@@ -772,7 +720,7 @@
           <w:b/>
           <w:lang w:val="en-US"/>
         </w:rPr>
-        <w:t>C</w:t>
+        <w:t>T</w:t>
       </w:r>
       <w:r>
         <w:rPr>
@@ -780,30 +728,77 @@
           <w:b/>
           <w:lang w:val="en-US"/>
         </w:rPr>
-        <w:t xml:space="preserve">hoose a previous project that </w:t>
-      </w:r>
-      <w:proofErr w:type="gramStart"/>
-      <w:r>
-        <w:rPr>
-          <w:rFonts w:asciiTheme="minorEastAsia" w:hAnsiTheme="minorEastAsia"/>
-          <w:b/>
-          <w:lang w:val="en-US"/>
-        </w:rPr>
-        <w:t>interested</w:t>
-      </w:r>
-      <w:proofErr w:type="gramEnd"/>
-      <w:r>
-        <w:rPr>
-          <w:rFonts w:asciiTheme="minorEastAsia" w:hAnsiTheme="minorEastAsia"/>
-          <w:b/>
-          <w:lang w:val="en-US"/>
-        </w:rPr>
-        <w:t xml:space="preserve"> you, download their final reports and their code if they had. Read though those materials. Connect with those previous students and review them</w:t>
+        <w:t>he source code of you</w:t>
       </w:r>
       <w:r>
         <w:rPr>
           <w:rFonts w:asciiTheme="minorEastAsia" w:hAnsiTheme="minorEastAsia"/>
           <w:b/>
+          <w:lang w:val="en-US"/>
+        </w:rPr>
+        <w:t>r</w:t>
+      </w:r>
+      <w:r>
+        <w:rPr>
+          <w:rFonts w:asciiTheme="minorEastAsia" w:hAnsiTheme="minorEastAsia"/>
+          <w:b/>
+          <w:lang w:val="en-US"/>
+        </w:rPr>
+        <w:t xml:space="preserve"> work will be submitted to the project repository under your registration of the Git</w:t>
+      </w:r>
+      <w:r>
+        <w:rPr>
+          <w:rFonts w:asciiTheme="minorEastAsia" w:hAnsiTheme="minorEastAsia"/>
+          <w:b/>
+          <w:lang w:val="en-US"/>
+        </w:rPr>
+        <w:t>H</w:t>
+      </w:r>
+      <w:r>
+        <w:rPr>
+          <w:rFonts w:asciiTheme="minorEastAsia" w:hAnsiTheme="minorEastAsia"/>
+          <w:b/>
+          <w:lang w:val="en-US"/>
+        </w:rPr>
+        <w:t>ub accoun</w:t>
+      </w:r>
+      <w:r>
+        <w:rPr>
+          <w:rFonts w:asciiTheme="minorEastAsia" w:hAnsiTheme="minorEastAsia"/>
+          <w:b/>
+          <w:lang w:val="en-US"/>
+        </w:rPr>
+        <w:t>t.</w:t>
+      </w:r>
+    </w:p>
+    <w:p>
+      <w:pPr>
+        <w:jc w:val="both"/>
+        <w:rPr>
+          <w:rFonts w:asciiTheme="minorEastAsia" w:hAnsiTheme="minorEastAsia"/>
+          <w:lang w:val="en-US"/>
+        </w:rPr>
+      </w:pPr>
+      <w:r>
+        <w:rPr>
+          <w:rFonts w:asciiTheme="minorEastAsia" w:hAnsiTheme="minorEastAsia"/>
+          <w:lang w:val="en-US"/>
+        </w:rPr>
+        <w:t xml:space="preserve">The project repository is available under the following link: </w:t>
+      </w:r>
+      <w:hyperlink r:id="rId12" w:history="1">
+        <w:r>
+          <w:rPr>
+            <w:rStyle w:val="Hyperlink"/>
+            <w:rFonts w:asciiTheme="minorEastAsia" w:hAnsiTheme="minorEastAsia"/>
+            <w:lang w:val="en-US"/>
+          </w:rPr>
+          <w:t>https://github.com/pascal-stoll/calculator-2</w:t>
+        </w:r>
+      </w:hyperlink>
+      <w:r>
+        <w:rPr>
+          <w:rFonts w:asciiTheme="minorEastAsia" w:hAnsiTheme="minorEastAsia"/>
           <w:lang w:val="en-US"/>
         </w:rPr>
         <w:t>.</w:t>
@@ -817,101 +812,57 @@
           <w:lang w:val="en-US"/>
         </w:rPr>
       </w:pPr>
+    </w:p>
+    <w:p>
+      <w:pPr>
+        <w:pStyle w:val="Listenabsatz"/>
+        <w:numPr>
+          <w:ilvl w:val="0"/>
+          <w:numId w:val="1"/>
+        </w:numPr>
+        <w:jc w:val="both"/>
+        <w:rPr>
+          <w:rFonts w:asciiTheme="minorEastAsia" w:hAnsiTheme="minorEastAsia"/>
+          <w:b/>
+          <w:lang w:val="en-US"/>
+        </w:rPr>
+      </w:pPr>
       <w:r>
         <w:rPr>
           <w:rFonts w:asciiTheme="minorEastAsia" w:hAnsiTheme="minorEastAsia"/>
-          <w:noProof/>
-          <w:lang w:val="en-US"/>
-        </w:rPr>
-        <w:drawing>
-          <wp:anchor distT="0" distB="0" distL="114300" distR="114300" simplePos="0" relativeHeight="251658240" behindDoc="0" locked="0" layoutInCell="1" allowOverlap="1" wp14:anchorId="4DE9BF81" wp14:editId="32EB0DCB">
-            <wp:simplePos x="0" y="0"/>
-            <wp:positionH relativeFrom="margin">
-              <wp:posOffset>2176780</wp:posOffset>
-            </wp:positionH>
-            <wp:positionV relativeFrom="paragraph">
-              <wp:posOffset>1414145</wp:posOffset>
-            </wp:positionV>
-            <wp:extent cx="1143000" cy="1161415"/>
-            <wp:effectExtent l="0" t="0" r="0" b="635"/>
-            <wp:wrapTopAndBottom/>
-            <wp:docPr id="1991728392" name="Grafik 1"/>
-            <wp:cNvGraphicFramePr>
-              <a:graphicFrameLocks xmlns:a="http://schemas.openxmlformats.org/drawingml/2006/main" noChangeAspect="1"/>
-            </wp:cNvGraphicFramePr>
-            <a:graphic xmlns:a="http://schemas.openxmlformats.org/drawingml/2006/main">
-              <a:graphicData uri="http://schemas.openxmlformats.org/drawingml/2006/picture">
-                <pic:pic xmlns:pic="http://schemas.openxmlformats.org/drawingml/2006/picture">
-                  <pic:nvPicPr>
-                    <pic:cNvPr id="1991728392" name=""/>
-                    <pic:cNvPicPr/>
-                  </pic:nvPicPr>
-                  <pic:blipFill>
-                    <a:blip r:embed="rId12" cstate="print">
-                      <a:extLst>
-                        <a:ext uri="{28A0092B-C50C-407E-A947-70E740481C1C}">
-                          <a14:useLocalDpi xmlns:a14="http://schemas.microsoft.com/office/drawing/2010/main" val="0"/>
-                        </a:ext>
-                      </a:extLst>
-                    </a:blip>
-                    <a:stretch>
-                      <a:fillRect/>
-                    </a:stretch>
-                  </pic:blipFill>
-                  <pic:spPr>
-                    <a:xfrm>
-                      <a:off x="0" y="0"/>
-                      <a:ext cx="1143000" cy="1161415"/>
-                    </a:xfrm>
-                    <a:prstGeom prst="rect">
-                      <a:avLst/>
-                    </a:prstGeom>
-                  </pic:spPr>
-                </pic:pic>
-              </a:graphicData>
-            </a:graphic>
-            <wp14:sizeRelH relativeFrom="margin">
-              <wp14:pctWidth>0</wp14:pctWidth>
-            </wp14:sizeRelH>
-            <wp14:sizeRelV relativeFrom="margin">
-              <wp14:pctHeight>0</wp14:pctHeight>
-            </wp14:sizeRelV>
-          </wp:anchor>
-        </w:drawing>
+          <w:b/>
+          <w:lang w:val="en-US"/>
+        </w:rPr>
+        <w:t>Summary: What</w:t>
       </w:r>
       <w:r>
         <w:rPr>
           <w:rFonts w:asciiTheme="minorEastAsia" w:hAnsiTheme="minorEastAsia"/>
-          <w:lang w:val="en-US"/>
-        </w:rPr>
-        <w:t xml:space="preserve">We were most interested in the </w:t>
+          <w:b/>
+          <w:lang w:val="en-US"/>
+        </w:rPr>
+        <w:t xml:space="preserve"> are your </w:t>
       </w:r>
       <w:r>
         <w:rPr>
           <w:rFonts w:asciiTheme="minorEastAsia" w:hAnsiTheme="minorEastAsia"/>
-          <w:lang w:val="en-US"/>
-        </w:rPr>
-        <w:t>“</w:t>
-      </w:r>
-      <w:proofErr w:type="spellStart"/>
-      <w:r>
-        <w:rPr>
-          <w:rFonts w:asciiTheme="minorEastAsia" w:hAnsiTheme="minorEastAsia"/>
-          <w:lang w:val="en-US"/>
-        </w:rPr>
-        <w:t>XianZai</w:t>
-      </w:r>
-      <w:proofErr w:type="spellEnd"/>
-      <w:r>
-        <w:rPr>
-          <w:rFonts w:asciiTheme="minorEastAsia" w:hAnsiTheme="minorEastAsia"/>
-          <w:lang w:val="en-US"/>
-        </w:rPr>
-        <w:t>”</w:t>
+          <w:b/>
+          <w:lang w:val="en-US"/>
+        </w:rPr>
+        <w:t>feeling</w:t>
       </w:r>
       <w:r>
         <w:rPr>
           <w:rFonts w:asciiTheme="minorEastAsia" w:hAnsiTheme="minorEastAsia"/>
+          <w:b/>
+          <w:lang w:val="en-US"/>
+        </w:rPr>
+        <w:t>s</w:t>
+      </w:r>
+      <w:r>
+        <w:rPr>
+          <w:rFonts w:asciiTheme="minorEastAsia" w:hAnsiTheme="minorEastAsia"/>
+          <w:b/>
           <w:lang w:val="en-US"/>
         </w:rPr>
         <w:t xml:space="preserve"> </w:t>
@@ -919,144 +870,34 @@
       <w:r>
         <w:rPr>
           <w:rFonts w:asciiTheme="minorEastAsia" w:hAnsiTheme="minorEastAsia"/>
-          <w:lang w:val="en-US"/>
-        </w:rPr>
-        <w:t>a</w:t>
+          <w:b/>
+          <w:lang w:val="en-US"/>
+        </w:rPr>
+        <w:t>about</w:t>
       </w:r>
       <w:r>
         <w:rPr>
           <w:rFonts w:asciiTheme="minorEastAsia" w:hAnsiTheme="minorEastAsia"/>
-          <w:lang w:val="en-US"/>
-        </w:rPr>
-        <w:t>pp.</w:t>
-      </w:r>
-      <w:r>
-        <w:rPr>
-          <w:rFonts w:asciiTheme="minorEastAsia" w:hAnsiTheme="minorEastAsia"/>
-          <w:lang w:val="en-US"/>
-        </w:rPr>
-        <w:t xml:space="preserve"> The idea of an app combining productivity and time management inspired us.</w:t>
-      </w:r>
-      <w:r>
-        <w:rPr>
-          <w:rFonts w:asciiTheme="minorEastAsia" w:hAnsiTheme="minorEastAsia"/>
-          <w:lang w:val="en-US"/>
-        </w:rPr>
-        <w:t xml:space="preserve"> </w:t>
-      </w:r>
-      <w:r>
-        <w:rPr>
-          <w:rFonts w:asciiTheme="minorEastAsia" w:hAnsiTheme="minorEastAsia"/>
-          <w:lang w:val="en-US"/>
-        </w:rPr>
-        <w:t xml:space="preserve">We reached out to </w:t>
-      </w:r>
-      <w:r>
-        <w:rPr>
-          <w:rFonts w:asciiTheme="minorEastAsia" w:hAnsiTheme="minorEastAsia"/>
-          <w:lang w:val="en-US"/>
-        </w:rPr>
-        <w:t xml:space="preserve">Amedeo </w:t>
-      </w:r>
-      <w:r>
-        <w:rPr>
-          <w:rFonts w:asciiTheme="minorEastAsia" w:hAnsiTheme="minorEastAsia"/>
-          <w:lang w:val="en-US"/>
-        </w:rPr>
-        <w:t xml:space="preserve">and Thierry, the developer of the </w:t>
-      </w:r>
-      <w:r>
-        <w:rPr>
-          <w:rFonts w:asciiTheme="minorEastAsia" w:hAnsiTheme="minorEastAsia"/>
-          <w:lang w:val="en-US"/>
-        </w:rPr>
-        <w:t>app,</w:t>
-      </w:r>
-      <w:r>
-        <w:rPr>
-          <w:rFonts w:asciiTheme="minorEastAsia" w:hAnsiTheme="minorEastAsia"/>
-          <w:lang w:val="en-US"/>
-        </w:rPr>
-        <w:t xml:space="preserve"> and asked the following questions.</w:t>
-      </w:r>
-      <w:r>
-        <w:rPr>
-          <w:rFonts w:asciiTheme="minorEastAsia" w:hAnsiTheme="minorEastAsia"/>
-          <w:lang w:val="en-US"/>
-        </w:rPr>
-        <w:t xml:space="preserve"> We did not only state their answers but also </w:t>
-      </w:r>
-      <w:r>
-        <w:rPr>
-          <w:rFonts w:asciiTheme="minorEastAsia" w:hAnsiTheme="minorEastAsia"/>
-          <w:lang w:val="en-US"/>
-        </w:rPr>
-        <w:t>reflect on</w:t>
-      </w:r>
-      <w:r>
-        <w:rPr>
-          <w:rFonts w:asciiTheme="minorEastAsia" w:hAnsiTheme="minorEastAsia"/>
-          <w:lang w:val="en-US"/>
-        </w:rPr>
-        <w:t xml:space="preserve"> our thoughts and learnings </w:t>
-      </w:r>
-      <w:r>
-        <w:rPr>
-          <w:rFonts w:asciiTheme="minorEastAsia" w:hAnsiTheme="minorEastAsia"/>
-          <w:lang w:val="en-US"/>
-        </w:rPr>
-        <w:t xml:space="preserve">we keep in mind </w:t>
-      </w:r>
-      <w:r>
-        <w:rPr>
-          <w:rFonts w:asciiTheme="minorEastAsia" w:hAnsiTheme="minorEastAsia"/>
-          <w:lang w:val="en-US"/>
-        </w:rPr>
-        <w:t>for our software engineering project.</w:t>
+          <w:b/>
+          <w:lang w:val="en-US"/>
+        </w:rPr>
+        <w:t xml:space="preserve"> this experience?</w:t>
       </w:r>
     </w:p>
     <w:p>
       <w:pPr>
-        <w:jc w:val="center"/>
-        <w:rPr>
-          <w:rFonts w:asciiTheme="minorEastAsia" w:hAnsiTheme="minorEastAsia"/>
-          <w:i/>
-          <w:sz w:val="22"/>
-          <w:szCs w:val="22"/>
+        <w:jc w:val="both"/>
+        <w:rPr>
+          <w:rFonts w:asciiTheme="minorEastAsia" w:hAnsiTheme="minorEastAsia"/>
           <w:lang w:val="en-US"/>
         </w:rPr>
       </w:pPr>
       <w:r>
         <w:rPr>
           <w:rFonts w:asciiTheme="minorEastAsia" w:hAnsiTheme="minorEastAsia"/>
-          <w:i/>
-          <w:sz w:val="22"/>
-          <w:szCs w:val="22"/>
-          <w:lang w:val="en-US"/>
-        </w:rPr>
-        <w:t xml:space="preserve">Figure 1: The logo of the </w:t>
-      </w:r>
-      <w:proofErr w:type="spellStart"/>
-      <w:r>
-        <w:rPr>
-          <w:rFonts w:asciiTheme="minorEastAsia" w:hAnsiTheme="minorEastAsia"/>
-          <w:i/>
-          <w:sz w:val="22"/>
-          <w:szCs w:val="22"/>
-          <w:lang w:val="en-US"/>
-        </w:rPr>
-        <w:t>XianZai</w:t>
-      </w:r>
-      <w:proofErr w:type="spellEnd"/>
-      <w:r>
-        <w:rPr>
-          <w:rFonts w:asciiTheme="minorEastAsia" w:hAnsiTheme="minorEastAsia"/>
-          <w:i/>
-          <w:sz w:val="22"/>
-          <w:szCs w:val="22"/>
-          <w:lang w:val="en-US"/>
-        </w:rPr>
-        <w:t xml:space="preserve"> app.</w:t>
+          <w:lang w:val="en-US"/>
+        </w:rPr>
+        <w:t>Text</w:t>
       </w:r>
     </w:p>
     <w:p>
@@ -1072,87 +913,23 @@
       <w:pPr>
         <w:pStyle w:val="Listenabsatz"/>
         <w:numPr>
-          <w:ilvl w:val="1"/>
+          <w:ilvl w:val="0"/>
           <w:numId w:val="1"/>
         </w:numPr>
+        <w:jc w:val="both"/>
         <w:rPr>
           <w:rFonts w:asciiTheme="minorEastAsia" w:hAnsiTheme="minorEastAsia"/>
           <w:b/>
-          <w:i/>
           <w:lang w:val="en-US"/>
         </w:rPr>
       </w:pPr>
       <w:r>
         <w:rPr>
           <w:rFonts w:asciiTheme="minorEastAsia" w:hAnsiTheme="minorEastAsia"/>
-          <w:i/>
-          <w:lang w:val="en-US"/>
-        </w:rPr>
-        <w:t>Do</w:t>
-      </w:r>
-      <w:r>
-        <w:rPr>
-          <w:rFonts w:asciiTheme="minorEastAsia" w:hAnsiTheme="minorEastAsia"/>
-          <w:i/>
-          <w:lang w:val="en-US"/>
-        </w:rPr>
-        <w:t>es</w:t>
-      </w:r>
-      <w:r>
-        <w:rPr>
-          <w:rFonts w:asciiTheme="minorEastAsia" w:hAnsiTheme="minorEastAsia"/>
-          <w:i/>
-          <w:lang w:val="en-US"/>
-        </w:rPr>
-        <w:t xml:space="preserve"> </w:t>
-      </w:r>
-      <w:r>
-        <w:rPr>
-          <w:rFonts w:asciiTheme="minorEastAsia" w:hAnsiTheme="minorEastAsia"/>
-          <w:i/>
-          <w:lang w:val="en-US"/>
-        </w:rPr>
-        <w:t>your</w:t>
-      </w:r>
-      <w:r>
-        <w:rPr>
-          <w:rFonts w:asciiTheme="minorEastAsia" w:hAnsiTheme="minorEastAsia"/>
-          <w:i/>
-          <w:lang w:val="en-US"/>
-        </w:rPr>
-        <w:t xml:space="preserve"> </w:t>
-      </w:r>
-      <w:r>
-        <w:rPr>
-          <w:rFonts w:asciiTheme="minorEastAsia" w:hAnsiTheme="minorEastAsia"/>
-          <w:i/>
-          <w:lang w:val="en-US"/>
-        </w:rPr>
-        <w:t>a</w:t>
-      </w:r>
-      <w:r>
-        <w:rPr>
-          <w:rFonts w:asciiTheme="minorEastAsia" w:hAnsiTheme="minorEastAsia"/>
-          <w:i/>
-          <w:lang w:val="en-US"/>
-        </w:rPr>
-        <w:t>pp active</w:t>
-      </w:r>
-      <w:r>
-        <w:rPr>
-          <w:rFonts w:asciiTheme="minorEastAsia" w:hAnsiTheme="minorEastAsia"/>
-          <w:i/>
-          <w:lang w:val="en-US"/>
-        </w:rPr>
-        <w:t>ly</w:t>
-      </w:r>
-      <w:r>
-        <w:rPr>
-          <w:rFonts w:asciiTheme="minorEastAsia" w:hAnsiTheme="minorEastAsia"/>
-          <w:i/>
-          <w:lang w:val="en-US"/>
-        </w:rPr>
-        <w:t xml:space="preserve"> work now?</w:t>
+          <w:b/>
+          <w:lang w:val="en-US"/>
+        </w:rPr>
+        <w:t>Review your partner with a hamburger method and be sure to give the He or She an improvement.</w:t>
       </w:r>
     </w:p>
     <w:p>
@@ -1168,64 +945,15 @@
           <w:rFonts w:asciiTheme="minorEastAsia" w:hAnsiTheme="minorEastAsia"/>
           <w:lang w:val="en-US"/>
         </w:rPr>
-        <w:t>Unfor</w:t>
+        <w:lastRenderedPageBreak/>
+        <w:t>Text</w:t>
       </w:r>
       <w:r>
         <w:rPr>
           <w:rFonts w:asciiTheme="minorEastAsia" w:hAnsiTheme="minorEastAsia"/>
           <w:lang w:val="en-US"/>
         </w:rPr>
-        <w:t xml:space="preserve">tunately, their app is </w:t>
-      </w:r>
-      <w:r>
-        <w:rPr>
-          <w:rFonts w:asciiTheme="minorEastAsia" w:hAnsiTheme="minorEastAsia"/>
-          <w:b/>
-          <w:lang w:val="en-US"/>
-        </w:rPr>
-        <w:t>not active anymore</w:t>
-      </w:r>
-      <w:r>
-        <w:rPr>
-          <w:rFonts w:asciiTheme="minorEastAsia" w:hAnsiTheme="minorEastAsia"/>
-          <w:lang w:val="en-US"/>
-        </w:rPr>
-        <w:t xml:space="preserve"> and was never available in app stores </w:t>
-      </w:r>
-      <w:r>
-        <w:rPr>
-          <w:rFonts w:asciiTheme="minorEastAsia" w:hAnsiTheme="minorEastAsia"/>
-          <w:lang w:val="en-US"/>
-        </w:rPr>
-        <w:t>to download</w:t>
-      </w:r>
-      <w:r>
-        <w:rPr>
-          <w:rFonts w:asciiTheme="minorEastAsia" w:hAnsiTheme="minorEastAsia"/>
-          <w:lang w:val="en-US"/>
-        </w:rPr>
-        <w:t xml:space="preserve">. Perhaps they developed this project for this class exclusively and had no intention of publishing it. Maybe not all features of the app were fully implemented </w:t>
-      </w:r>
-      <w:r>
-        <w:rPr>
-          <w:rFonts w:asciiTheme="minorEastAsia" w:hAnsiTheme="minorEastAsia"/>
-          <w:lang w:val="en-US"/>
-        </w:rPr>
-        <w:t xml:space="preserve">due to time constraints, which would render </w:t>
-      </w:r>
-      <w:r>
-        <w:rPr>
-          <w:rFonts w:asciiTheme="minorEastAsia" w:hAnsiTheme="minorEastAsia"/>
-          <w:lang w:val="en-US"/>
-        </w:rPr>
-        <w:t xml:space="preserve">a release more difficult. </w:t>
-      </w:r>
-      <w:r>
-        <w:rPr>
-          <w:rFonts w:asciiTheme="minorEastAsia" w:hAnsiTheme="minorEastAsia"/>
-          <w:lang w:val="en-US"/>
-        </w:rPr>
-        <w:t>There are many obstacles from transforming a prototypical university project into a real-life working product.</w:t>
+        <w:t>.</w:t>
       </w:r>
     </w:p>
     <w:p>
@@ -1236,791 +964,1747 @@
           <w:lang w:val="en-US"/>
         </w:rPr>
       </w:pPr>
+    </w:p>
+    <w:p>
+      <w:pPr>
+        <w:pStyle w:val="Listenabsatz"/>
+        <w:numPr>
+          <w:ilvl w:val="0"/>
+          <w:numId w:val="1"/>
+        </w:numPr>
+        <w:jc w:val="both"/>
+        <w:rPr>
+          <w:rFonts w:asciiTheme="minorEastAsia" w:hAnsiTheme="minorEastAsia"/>
+          <w:b/>
+          <w:lang w:val="en-US"/>
+        </w:rPr>
+      </w:pPr>
       <w:r>
         <w:rPr>
           <w:rFonts w:asciiTheme="minorEastAsia" w:hAnsiTheme="minorEastAsia"/>
-          <w:lang w:val="en-US"/>
-        </w:rPr>
-        <w:t xml:space="preserve">For our </w:t>
+          <w:b/>
+          <w:lang w:val="en-US"/>
+        </w:rPr>
+        <w:t>Finishing the following Personal Software Process</w:t>
       </w:r>
       <w:r>
         <w:rPr>
           <w:rFonts w:asciiTheme="minorEastAsia" w:hAnsiTheme="minorEastAsia"/>
-          <w:lang w:val="en-US"/>
-        </w:rPr>
-        <w:t>project, we therefore set the goal of developing a software product whose features are fully implemented. We want to provide a coherent user experience where all necessary features are available. Knowing the scope of the project, prioritizing and focusing on the more important features first are important aspects to keep in mind.</w:t>
+          <w:b/>
+          <w:lang w:val="en-US"/>
+        </w:rPr>
+        <w:t xml:space="preserve"> (</w:t>
+      </w:r>
+      <w:r>
+        <w:rPr>
+          <w:rFonts w:asciiTheme="minorEastAsia" w:hAnsiTheme="minorEastAsia"/>
+          <w:b/>
+          <w:lang w:val="en-US"/>
+        </w:rPr>
+        <w:t>PSP</w:t>
+      </w:r>
+      <w:r>
+        <w:rPr>
+          <w:rFonts w:asciiTheme="minorEastAsia" w:hAnsiTheme="minorEastAsia"/>
+          <w:b/>
+          <w:lang w:val="en-US"/>
+        </w:rPr>
+        <w:t>)</w:t>
       </w:r>
     </w:p>
+    <w:tbl>
+      <w:tblPr>
+        <w:tblW w:w="0" w:type="auto"/>
+        <w:tblBorders>
+          <w:top w:val="single" w:sz="4" w:space="0" w:color="auto"/>
+          <w:left w:val="single" w:sz="4" w:space="0" w:color="auto"/>
+          <w:bottom w:val="single" w:sz="4" w:space="0" w:color="auto"/>
+          <w:right w:val="single" w:sz="4" w:space="0" w:color="auto"/>
+          <w:insideH w:val="single" w:sz="4" w:space="0" w:color="auto"/>
+          <w:insideV w:val="single" w:sz="4" w:space="0" w:color="auto"/>
+        </w:tblBorders>
+        <w:shd w:val="clear" w:color="auto" w:fill="FFFFFF"/>
+        <w:tblCellMar>
+          <w:left w:w="57" w:type="dxa"/>
+          <w:right w:w="57" w:type="dxa"/>
+        </w:tblCellMar>
+        <w:tblLook w:val="04A0" w:firstRow="1" w:lastRow="0" w:firstColumn="1" w:lastColumn="0" w:noHBand="0" w:noVBand="1"/>
+      </w:tblPr>
+      <w:tblGrid>
+        <w:gridCol w:w="4549"/>
+        <w:gridCol w:w="2492"/>
+        <w:gridCol w:w="2021"/>
+      </w:tblGrid>
+      <w:tr>
+        <w:trPr>
+          <w:trHeight w:val="40"/>
+        </w:trPr>
+        <w:tc>
+          <w:tcPr>
+            <w:tcW w:w="0" w:type="auto"/>
+            <w:shd w:val="clear" w:color="auto" w:fill="FFFFFF"/>
+            <w:tcMar>
+              <w:top w:w="120" w:type="dxa"/>
+              <w:left w:w="210" w:type="dxa"/>
+              <w:bottom w:w="120" w:type="dxa"/>
+              <w:right w:w="210" w:type="dxa"/>
+            </w:tcMar>
+            <w:hideMark/>
+          </w:tcPr>
+          <w:p>
+            <w:pPr>
+              <w:spacing w:after="0" w:line="240" w:lineRule="auto"/>
+              <w:rPr>
+                <w:rFonts w:asciiTheme="minorEastAsia" w:hAnsiTheme="minorEastAsia"/>
+                <w:sz w:val="20"/>
+                <w:szCs w:val="20"/>
+                <w:lang w:val="en-US"/>
+              </w:rPr>
+            </w:pPr>
+            <w:r>
+              <w:rPr>
+                <w:rFonts w:asciiTheme="minorEastAsia" w:hAnsiTheme="minorEastAsia"/>
+                <w:b/>
+                <w:sz w:val="20"/>
+                <w:szCs w:val="20"/>
+                <w:lang w:val="en-US"/>
+              </w:rPr>
+              <w:t>PSP2.1</w:t>
+            </w:r>
+            <w:r>
+              <w:rPr>
+                <w:rFonts w:asciiTheme="minorEastAsia" w:hAnsiTheme="minorEastAsia"/>
+                <w:b/>
+                <w:sz w:val="20"/>
+                <w:szCs w:val="20"/>
+                <w:lang w:val="en-US"/>
+              </w:rPr>
+              <w:t xml:space="preserve"> </w:t>
+            </w:r>
+            <w:r>
+              <w:rPr>
+                <w:rFonts w:asciiTheme="minorEastAsia" w:hAnsiTheme="minorEastAsia"/>
+                <w:b/>
+                <w:sz w:val="20"/>
+                <w:szCs w:val="20"/>
+                <w:lang w:val="en-US"/>
+              </w:rPr>
+              <w:t>(Personal Software Process)</w:t>
+            </w:r>
+          </w:p>
+        </w:tc>
+        <w:tc>
+          <w:tcPr>
+            <w:tcW w:w="0" w:type="auto"/>
+          </w:tcPr>
+          <w:p>
+            <w:pPr>
+              <w:spacing w:after="0" w:line="240" w:lineRule="auto"/>
+              <w:rPr>
+                <w:rFonts w:asciiTheme="minorEastAsia" w:hAnsiTheme="minorEastAsia"/>
+                <w:b/>
+                <w:sz w:val="20"/>
+                <w:szCs w:val="20"/>
+                <w:lang w:val="en-US"/>
+              </w:rPr>
+            </w:pPr>
+            <w:r>
+              <w:rPr>
+                <w:rFonts w:asciiTheme="minorEastAsia" w:hAnsiTheme="minorEastAsia"/>
+                <w:b/>
+                <w:sz w:val="20"/>
+                <w:szCs w:val="20"/>
+                <w:lang w:val="en-US"/>
+              </w:rPr>
+              <w:t>Estimated the time required to complete and why</w:t>
+            </w:r>
+            <w:r>
+              <w:rPr>
+                <w:rFonts w:asciiTheme="minorEastAsia" w:hAnsiTheme="minorEastAsia"/>
+                <w:b/>
+                <w:sz w:val="20"/>
+                <w:szCs w:val="20"/>
+                <w:lang w:val="en-US"/>
+              </w:rPr>
+              <w:t xml:space="preserve"> (min)</w:t>
+            </w:r>
+          </w:p>
+        </w:tc>
+        <w:tc>
+          <w:tcPr>
+            <w:tcW w:w="0" w:type="auto"/>
+          </w:tcPr>
+          <w:p>
+            <w:pPr>
+              <w:spacing w:after="0" w:line="240" w:lineRule="auto"/>
+              <w:rPr>
+                <w:rFonts w:asciiTheme="minorEastAsia" w:hAnsiTheme="minorEastAsia"/>
+                <w:b/>
+                <w:sz w:val="20"/>
+                <w:szCs w:val="20"/>
+                <w:lang w:val="en-US"/>
+              </w:rPr>
+            </w:pPr>
+            <w:r>
+              <w:rPr>
+                <w:rFonts w:asciiTheme="minorEastAsia" w:hAnsiTheme="minorEastAsia"/>
+                <w:b/>
+                <w:sz w:val="20"/>
+                <w:szCs w:val="20"/>
+                <w:lang w:val="en-US"/>
+              </w:rPr>
+              <w:t>Actual completion time and why</w:t>
+            </w:r>
+            <w:r>
+              <w:rPr>
+                <w:rFonts w:asciiTheme="minorEastAsia" w:hAnsiTheme="minorEastAsia"/>
+                <w:b/>
+                <w:sz w:val="20"/>
+                <w:szCs w:val="20"/>
+                <w:lang w:val="en-US"/>
+              </w:rPr>
+              <w:t xml:space="preserve"> (min)</w:t>
+            </w:r>
+          </w:p>
+        </w:tc>
+      </w:tr>
+      <w:tr>
+        <w:trPr>
+          <w:trHeight w:val="185"/>
+        </w:trPr>
+        <w:tc>
+          <w:tcPr>
+            <w:tcW w:w="0" w:type="auto"/>
+            <w:shd w:val="clear" w:color="auto" w:fill="FFFFFF"/>
+            <w:tcMar>
+              <w:top w:w="120" w:type="dxa"/>
+              <w:left w:w="210" w:type="dxa"/>
+              <w:bottom w:w="120" w:type="dxa"/>
+              <w:right w:w="210" w:type="dxa"/>
+            </w:tcMar>
+            <w:hideMark/>
+          </w:tcPr>
+          <w:p>
+            <w:pPr>
+              <w:spacing w:after="0" w:line="240" w:lineRule="auto"/>
+              <w:rPr>
+                <w:rFonts w:asciiTheme="minorEastAsia" w:hAnsiTheme="minorEastAsia"/>
+                <w:i/>
+                <w:sz w:val="20"/>
+                <w:szCs w:val="20"/>
+                <w:lang w:val="en-US"/>
+              </w:rPr>
+            </w:pPr>
+            <w:r>
+              <w:rPr>
+                <w:rFonts w:asciiTheme="minorEastAsia" w:hAnsiTheme="minorEastAsia"/>
+                <w:i/>
+                <w:sz w:val="20"/>
+                <w:szCs w:val="20"/>
+                <w:lang w:val="en-US"/>
+              </w:rPr>
+              <w:t>Planning</w:t>
+            </w:r>
+          </w:p>
+        </w:tc>
+        <w:tc>
+          <w:tcPr>
+            <w:tcW w:w="0" w:type="auto"/>
+          </w:tcPr>
+          <w:p>
+            <w:pPr>
+              <w:spacing w:after="0" w:line="240" w:lineRule="auto"/>
+              <w:jc w:val="right"/>
+              <w:rPr>
+                <w:rFonts w:asciiTheme="minorEastAsia" w:hAnsiTheme="minorEastAsia"/>
+                <w:sz w:val="20"/>
+                <w:szCs w:val="20"/>
+                <w:lang w:val="en-US"/>
+              </w:rPr>
+            </w:pPr>
+          </w:p>
+        </w:tc>
+        <w:tc>
+          <w:tcPr>
+            <w:tcW w:w="0" w:type="auto"/>
+          </w:tcPr>
+          <w:p>
+            <w:pPr>
+              <w:spacing w:after="0" w:line="240" w:lineRule="auto"/>
+              <w:jc w:val="right"/>
+              <w:rPr>
+                <w:rFonts w:asciiTheme="minorEastAsia" w:hAnsiTheme="minorEastAsia"/>
+                <w:sz w:val="20"/>
+                <w:szCs w:val="20"/>
+                <w:lang w:val="en-US"/>
+              </w:rPr>
+            </w:pPr>
+          </w:p>
+        </w:tc>
+      </w:tr>
+      <w:tr>
+        <w:trPr>
+          <w:trHeight w:val="148"/>
+        </w:trPr>
+        <w:tc>
+          <w:tcPr>
+            <w:tcW w:w="0" w:type="auto"/>
+            <w:shd w:val="clear" w:color="auto" w:fill="FFFFFF"/>
+            <w:tcMar>
+              <w:top w:w="120" w:type="dxa"/>
+              <w:left w:w="210" w:type="dxa"/>
+              <w:bottom w:w="120" w:type="dxa"/>
+              <w:right w:w="210" w:type="dxa"/>
+            </w:tcMar>
+            <w:hideMark/>
+          </w:tcPr>
+          <w:p>
+            <w:pPr>
+              <w:pStyle w:val="Listenabsatz"/>
+              <w:numPr>
+                <w:ilvl w:val="0"/>
+                <w:numId w:val="3"/>
+              </w:numPr>
+              <w:spacing w:after="0" w:line="240" w:lineRule="auto"/>
+              <w:rPr>
+                <w:rFonts w:asciiTheme="minorEastAsia" w:hAnsiTheme="minorEastAsia"/>
+                <w:sz w:val="20"/>
+                <w:szCs w:val="20"/>
+                <w:lang w:val="en-US"/>
+              </w:rPr>
+            </w:pPr>
+            <w:r>
+              <w:rPr>
+                <w:rFonts w:asciiTheme="minorEastAsia" w:hAnsiTheme="minorEastAsia"/>
+                <w:sz w:val="20"/>
+                <w:szCs w:val="20"/>
+                <w:lang w:val="en-US"/>
+              </w:rPr>
+              <w:t>Estimate</w:t>
+            </w:r>
+            <w:r>
+              <w:rPr>
+                <w:rFonts w:asciiTheme="minorEastAsia" w:hAnsiTheme="minorEastAsia" w:hint="eastAsia"/>
+                <w:sz w:val="20"/>
+                <w:szCs w:val="20"/>
+                <w:lang w:val="en-US"/>
+              </w:rPr>
+              <w:t>（</w:t>
+            </w:r>
+            <w:r>
+              <w:rPr>
+                <w:rFonts w:asciiTheme="minorEastAsia" w:hAnsiTheme="minorEastAsia"/>
+                <w:sz w:val="20"/>
+                <w:szCs w:val="20"/>
+                <w:lang w:val="en-US"/>
+              </w:rPr>
+              <w:t>t</w:t>
+            </w:r>
+            <w:r>
+              <w:rPr>
+                <w:rFonts w:asciiTheme="minorEastAsia" w:hAnsiTheme="minorEastAsia"/>
+                <w:sz w:val="20"/>
+                <w:szCs w:val="20"/>
+                <w:lang w:val="en-US"/>
+              </w:rPr>
+              <w:t xml:space="preserve">o </w:t>
+            </w:r>
+            <w:r>
+              <w:rPr>
+                <w:rFonts w:asciiTheme="minorEastAsia" w:hAnsiTheme="minorEastAsia"/>
+                <w:sz w:val="20"/>
+                <w:szCs w:val="20"/>
+                <w:lang w:val="en-US"/>
+              </w:rPr>
+              <w:t>e</w:t>
+            </w:r>
+            <w:r>
+              <w:rPr>
+                <w:rFonts w:asciiTheme="minorEastAsia" w:hAnsiTheme="minorEastAsia"/>
+                <w:sz w:val="20"/>
+                <w:szCs w:val="20"/>
+                <w:lang w:val="en-US"/>
+              </w:rPr>
+              <w:t>stimate how much time this task will take and plan the general steps</w:t>
+            </w:r>
+            <w:r>
+              <w:rPr>
+                <w:rFonts w:asciiTheme="minorEastAsia" w:hAnsiTheme="minorEastAsia" w:hint="eastAsia"/>
+                <w:sz w:val="20"/>
+                <w:szCs w:val="20"/>
+                <w:lang w:val="en-US"/>
+              </w:rPr>
+              <w:t>）</w:t>
+            </w:r>
+          </w:p>
+        </w:tc>
+        <w:tc>
+          <w:tcPr>
+            <w:tcW w:w="0" w:type="auto"/>
+          </w:tcPr>
+          <w:p>
+            <w:pPr>
+              <w:spacing w:after="0" w:line="240" w:lineRule="auto"/>
+              <w:jc w:val="right"/>
+              <w:rPr>
+                <w:rFonts w:asciiTheme="minorEastAsia" w:hAnsiTheme="minorEastAsia"/>
+                <w:sz w:val="20"/>
+                <w:szCs w:val="20"/>
+                <w:lang w:val="en-US"/>
+              </w:rPr>
+            </w:pPr>
+            <w:r>
+              <w:rPr>
+                <w:rFonts w:asciiTheme="minorEastAsia" w:hAnsiTheme="minorEastAsia"/>
+                <w:sz w:val="20"/>
+                <w:szCs w:val="20"/>
+                <w:lang w:val="en-US"/>
+              </w:rPr>
+              <w:t>15</w:t>
+            </w:r>
+          </w:p>
+        </w:tc>
+        <w:tc>
+          <w:tcPr>
+            <w:tcW w:w="0" w:type="auto"/>
+          </w:tcPr>
+          <w:p>
+            <w:pPr>
+              <w:spacing w:after="0" w:line="240" w:lineRule="auto"/>
+              <w:jc w:val="right"/>
+              <w:rPr>
+                <w:rFonts w:asciiTheme="minorEastAsia" w:hAnsiTheme="minorEastAsia"/>
+                <w:sz w:val="20"/>
+                <w:szCs w:val="20"/>
+                <w:lang w:val="en-US"/>
+              </w:rPr>
+            </w:pPr>
+            <w:r>
+              <w:rPr>
+                <w:rFonts w:asciiTheme="minorEastAsia" w:hAnsiTheme="minorEastAsia"/>
+                <w:sz w:val="20"/>
+                <w:szCs w:val="20"/>
+                <w:lang w:val="en-US"/>
+              </w:rPr>
+              <w:t>5</w:t>
+            </w:r>
+          </w:p>
+        </w:tc>
+      </w:tr>
+      <w:tr>
+        <w:trPr>
+          <w:trHeight w:val="17"/>
+        </w:trPr>
+        <w:tc>
+          <w:tcPr>
+            <w:tcW w:w="0" w:type="auto"/>
+            <w:shd w:val="clear" w:color="auto" w:fill="FFFFFF"/>
+            <w:tcMar>
+              <w:top w:w="120" w:type="dxa"/>
+              <w:left w:w="210" w:type="dxa"/>
+              <w:bottom w:w="120" w:type="dxa"/>
+              <w:right w:w="210" w:type="dxa"/>
+            </w:tcMar>
+            <w:hideMark/>
+          </w:tcPr>
+          <w:p>
+            <w:pPr>
+              <w:spacing w:after="0" w:line="240" w:lineRule="auto"/>
+              <w:rPr>
+                <w:rFonts w:asciiTheme="minorEastAsia" w:hAnsiTheme="minorEastAsia"/>
+                <w:i/>
+                <w:sz w:val="20"/>
+                <w:szCs w:val="20"/>
+                <w:lang w:val="en-US"/>
+              </w:rPr>
+            </w:pPr>
+            <w:r>
+              <w:rPr>
+                <w:rFonts w:asciiTheme="minorEastAsia" w:hAnsiTheme="minorEastAsia"/>
+                <w:i/>
+                <w:sz w:val="20"/>
+                <w:szCs w:val="20"/>
+                <w:lang w:val="en-US"/>
+              </w:rPr>
+              <w:t>Development</w:t>
+            </w:r>
+          </w:p>
+        </w:tc>
+        <w:tc>
+          <w:tcPr>
+            <w:tcW w:w="0" w:type="auto"/>
+          </w:tcPr>
+          <w:p>
+            <w:pPr>
+              <w:spacing w:after="0" w:line="240" w:lineRule="auto"/>
+              <w:jc w:val="right"/>
+              <w:rPr>
+                <w:rFonts w:asciiTheme="minorEastAsia" w:hAnsiTheme="minorEastAsia"/>
+                <w:sz w:val="20"/>
+                <w:szCs w:val="20"/>
+                <w:lang w:val="en-US"/>
+              </w:rPr>
+            </w:pPr>
+          </w:p>
+        </w:tc>
+        <w:tc>
+          <w:tcPr>
+            <w:tcW w:w="0" w:type="auto"/>
+          </w:tcPr>
+          <w:p>
+            <w:pPr>
+              <w:spacing w:after="0" w:line="240" w:lineRule="auto"/>
+              <w:jc w:val="right"/>
+              <w:rPr>
+                <w:rFonts w:asciiTheme="minorEastAsia" w:hAnsiTheme="minorEastAsia"/>
+                <w:sz w:val="20"/>
+                <w:szCs w:val="20"/>
+                <w:lang w:val="en-US"/>
+              </w:rPr>
+            </w:pPr>
+          </w:p>
+        </w:tc>
+      </w:tr>
+      <w:tr>
+        <w:trPr>
+          <w:trHeight w:val="17"/>
+        </w:trPr>
+        <w:tc>
+          <w:tcPr>
+            <w:tcW w:w="0" w:type="auto"/>
+            <w:shd w:val="clear" w:color="auto" w:fill="FFFFFF"/>
+            <w:tcMar>
+              <w:top w:w="120" w:type="dxa"/>
+              <w:left w:w="210" w:type="dxa"/>
+              <w:bottom w:w="120" w:type="dxa"/>
+              <w:right w:w="210" w:type="dxa"/>
+            </w:tcMar>
+            <w:hideMark/>
+          </w:tcPr>
+          <w:p>
+            <w:pPr>
+              <w:pStyle w:val="Listenabsatz"/>
+              <w:numPr>
+                <w:ilvl w:val="0"/>
+                <w:numId w:val="2"/>
+              </w:numPr>
+              <w:spacing w:after="0" w:line="240" w:lineRule="auto"/>
+              <w:rPr>
+                <w:rFonts w:asciiTheme="minorEastAsia" w:hAnsiTheme="minorEastAsia"/>
+                <w:sz w:val="20"/>
+                <w:szCs w:val="20"/>
+                <w:lang w:val="en-US"/>
+              </w:rPr>
+            </w:pPr>
+            <w:r>
+              <w:rPr>
+                <w:rFonts w:asciiTheme="minorEastAsia" w:hAnsiTheme="minorEastAsia"/>
+                <w:sz w:val="20"/>
+                <w:szCs w:val="20"/>
+                <w:lang w:val="en-US"/>
+              </w:rPr>
+              <w:t>Demand Analysis (including learning new technology)</w:t>
+            </w:r>
+          </w:p>
+        </w:tc>
+        <w:tc>
+          <w:tcPr>
+            <w:tcW w:w="0" w:type="auto"/>
+          </w:tcPr>
+          <w:p>
+            <w:pPr>
+              <w:spacing w:after="0" w:line="240" w:lineRule="auto"/>
+              <w:jc w:val="right"/>
+              <w:rPr>
+                <w:rFonts w:asciiTheme="minorEastAsia" w:hAnsiTheme="minorEastAsia"/>
+                <w:sz w:val="20"/>
+                <w:szCs w:val="20"/>
+                <w:lang w:val="en-US"/>
+              </w:rPr>
+            </w:pPr>
+            <w:r>
+              <w:rPr>
+                <w:rFonts w:asciiTheme="minorEastAsia" w:hAnsiTheme="minorEastAsia"/>
+                <w:sz w:val="20"/>
+                <w:szCs w:val="20"/>
+                <w:lang w:val="en-US"/>
+              </w:rPr>
+              <w:t>10</w:t>
+            </w:r>
+          </w:p>
+        </w:tc>
+        <w:tc>
+          <w:tcPr>
+            <w:tcW w:w="0" w:type="auto"/>
+          </w:tcPr>
+          <w:p>
+            <w:pPr>
+              <w:spacing w:after="0" w:line="240" w:lineRule="auto"/>
+              <w:jc w:val="right"/>
+              <w:rPr>
+                <w:rFonts w:asciiTheme="minorEastAsia" w:hAnsiTheme="minorEastAsia"/>
+                <w:sz w:val="20"/>
+                <w:szCs w:val="20"/>
+                <w:lang w:val="en-US"/>
+              </w:rPr>
+            </w:pPr>
+            <w:r>
+              <w:rPr>
+                <w:rFonts w:asciiTheme="minorEastAsia" w:hAnsiTheme="minorEastAsia"/>
+                <w:sz w:val="20"/>
+                <w:szCs w:val="20"/>
+                <w:lang w:val="en-US"/>
+              </w:rPr>
+              <w:t>4</w:t>
+            </w:r>
+          </w:p>
+        </w:tc>
+      </w:tr>
+      <w:tr>
+        <w:trPr>
+          <w:trHeight w:val="17"/>
+        </w:trPr>
+        <w:tc>
+          <w:tcPr>
+            <w:tcW w:w="0" w:type="auto"/>
+            <w:shd w:val="clear" w:color="auto" w:fill="FFFFFF"/>
+            <w:tcMar>
+              <w:top w:w="120" w:type="dxa"/>
+              <w:left w:w="210" w:type="dxa"/>
+              <w:bottom w:w="120" w:type="dxa"/>
+              <w:right w:w="210" w:type="dxa"/>
+            </w:tcMar>
+            <w:hideMark/>
+          </w:tcPr>
+          <w:p>
+            <w:pPr>
+              <w:pStyle w:val="Listenabsatz"/>
+              <w:numPr>
+                <w:ilvl w:val="0"/>
+                <w:numId w:val="2"/>
+              </w:numPr>
+              <w:spacing w:after="0" w:line="240" w:lineRule="auto"/>
+              <w:rPr>
+                <w:rFonts w:asciiTheme="minorEastAsia" w:hAnsiTheme="minorEastAsia"/>
+                <w:sz w:val="20"/>
+                <w:szCs w:val="20"/>
+                <w:lang w:val="en-US"/>
+              </w:rPr>
+            </w:pPr>
+            <w:r>
+              <w:rPr>
+                <w:rFonts w:asciiTheme="minorEastAsia" w:hAnsiTheme="minorEastAsia"/>
+                <w:sz w:val="20"/>
+                <w:szCs w:val="20"/>
+                <w:lang w:val="en-US"/>
+              </w:rPr>
+              <w:t>Design Spec (</w:t>
+            </w:r>
+            <w:r>
+              <w:rPr>
+                <w:rFonts w:asciiTheme="minorEastAsia" w:hAnsiTheme="minorEastAsia"/>
+                <w:sz w:val="20"/>
+                <w:szCs w:val="20"/>
+                <w:lang w:val="en-US"/>
+              </w:rPr>
+              <w:t>g</w:t>
+            </w:r>
+            <w:r>
+              <w:rPr>
+                <w:rFonts w:asciiTheme="minorEastAsia" w:hAnsiTheme="minorEastAsia"/>
+                <w:sz w:val="20"/>
+                <w:szCs w:val="20"/>
+                <w:lang w:val="en-US"/>
+              </w:rPr>
+              <w:t>enerate design document</w:t>
+            </w:r>
+            <w:r>
+              <w:rPr>
+                <w:rFonts w:asciiTheme="minorEastAsia" w:hAnsiTheme="minorEastAsia" w:hint="eastAsia"/>
+                <w:sz w:val="20"/>
+                <w:szCs w:val="20"/>
+                <w:lang w:val="en-US"/>
+              </w:rPr>
+              <w:t>）</w:t>
+            </w:r>
+          </w:p>
+        </w:tc>
+        <w:tc>
+          <w:tcPr>
+            <w:tcW w:w="0" w:type="auto"/>
+          </w:tcPr>
+          <w:p>
+            <w:pPr>
+              <w:spacing w:after="0" w:line="240" w:lineRule="auto"/>
+              <w:jc w:val="right"/>
+              <w:rPr>
+                <w:rFonts w:asciiTheme="minorEastAsia" w:hAnsiTheme="minorEastAsia"/>
+                <w:sz w:val="20"/>
+                <w:szCs w:val="20"/>
+                <w:lang w:val="en-US"/>
+              </w:rPr>
+            </w:pPr>
+            <w:r>
+              <w:rPr>
+                <w:rFonts w:asciiTheme="minorEastAsia" w:hAnsiTheme="minorEastAsia"/>
+                <w:sz w:val="20"/>
+                <w:szCs w:val="20"/>
+                <w:lang w:val="en-US"/>
+              </w:rPr>
+              <w:t>30</w:t>
+            </w:r>
+          </w:p>
+        </w:tc>
+        <w:tc>
+          <w:tcPr>
+            <w:tcW w:w="0" w:type="auto"/>
+          </w:tcPr>
+          <w:p>
+            <w:pPr>
+              <w:spacing w:after="0" w:line="240" w:lineRule="auto"/>
+              <w:jc w:val="right"/>
+              <w:rPr>
+                <w:rFonts w:asciiTheme="minorEastAsia" w:hAnsiTheme="minorEastAsia"/>
+                <w:sz w:val="20"/>
+                <w:szCs w:val="20"/>
+                <w:lang w:val="en-US"/>
+              </w:rPr>
+            </w:pPr>
+            <w:r>
+              <w:rPr>
+                <w:rFonts w:asciiTheme="minorEastAsia" w:hAnsiTheme="minorEastAsia"/>
+                <w:sz w:val="20"/>
+                <w:szCs w:val="20"/>
+                <w:lang w:val="en-US"/>
+              </w:rPr>
+              <w:t>10</w:t>
+            </w:r>
+          </w:p>
+        </w:tc>
+      </w:tr>
+      <w:tr>
+        <w:trPr>
+          <w:trHeight w:val="17"/>
+        </w:trPr>
+        <w:tc>
+          <w:tcPr>
+            <w:tcW w:w="0" w:type="auto"/>
+            <w:shd w:val="clear" w:color="auto" w:fill="FFFFFF"/>
+            <w:tcMar>
+              <w:top w:w="120" w:type="dxa"/>
+              <w:left w:w="210" w:type="dxa"/>
+              <w:bottom w:w="120" w:type="dxa"/>
+              <w:right w:w="210" w:type="dxa"/>
+            </w:tcMar>
+            <w:hideMark/>
+          </w:tcPr>
+          <w:p>
+            <w:pPr>
+              <w:pStyle w:val="Listenabsatz"/>
+              <w:numPr>
+                <w:ilvl w:val="0"/>
+                <w:numId w:val="2"/>
+              </w:numPr>
+              <w:spacing w:after="0" w:line="240" w:lineRule="auto"/>
+              <w:rPr>
+                <w:rFonts w:asciiTheme="minorEastAsia" w:hAnsiTheme="minorEastAsia"/>
+                <w:sz w:val="20"/>
+                <w:szCs w:val="20"/>
+                <w:lang w:val="en-US"/>
+              </w:rPr>
+            </w:pPr>
+            <w:r>
+              <w:rPr>
+                <w:rFonts w:asciiTheme="minorEastAsia" w:hAnsiTheme="minorEastAsia"/>
+                <w:sz w:val="20"/>
+                <w:szCs w:val="20"/>
+                <w:lang w:val="en-US"/>
+              </w:rPr>
+              <w:t>Design Review (</w:t>
+            </w:r>
+            <w:r>
+              <w:rPr>
+                <w:rFonts w:asciiTheme="minorEastAsia" w:hAnsiTheme="minorEastAsia"/>
+                <w:sz w:val="20"/>
+                <w:szCs w:val="20"/>
+                <w:lang w:val="en-US"/>
+              </w:rPr>
+              <w:t>d</w:t>
+            </w:r>
+            <w:r>
+              <w:rPr>
+                <w:rFonts w:asciiTheme="minorEastAsia" w:hAnsiTheme="minorEastAsia"/>
+                <w:sz w:val="20"/>
+                <w:szCs w:val="20"/>
+                <w:lang w:val="en-US"/>
+              </w:rPr>
+              <w:t>esign review and co-worker review and design document)</w:t>
+            </w:r>
+          </w:p>
+        </w:tc>
+        <w:tc>
+          <w:tcPr>
+            <w:tcW w:w="0" w:type="auto"/>
+          </w:tcPr>
+          <w:p>
+            <w:pPr>
+              <w:spacing w:after="0" w:line="240" w:lineRule="auto"/>
+              <w:jc w:val="right"/>
+              <w:rPr>
+                <w:rFonts w:asciiTheme="minorEastAsia" w:hAnsiTheme="minorEastAsia"/>
+                <w:sz w:val="20"/>
+                <w:szCs w:val="20"/>
+                <w:lang w:val="en-US"/>
+              </w:rPr>
+            </w:pPr>
+            <w:r>
+              <w:rPr>
+                <w:rFonts w:asciiTheme="minorEastAsia" w:hAnsiTheme="minorEastAsia"/>
+                <w:sz w:val="20"/>
+                <w:szCs w:val="20"/>
+                <w:lang w:val="en-US"/>
+              </w:rPr>
+              <w:t>20</w:t>
+            </w:r>
+          </w:p>
+        </w:tc>
+        <w:tc>
+          <w:tcPr>
+            <w:tcW w:w="0" w:type="auto"/>
+          </w:tcPr>
+          <w:p>
+            <w:pPr>
+              <w:spacing w:after="0" w:line="240" w:lineRule="auto"/>
+              <w:jc w:val="right"/>
+              <w:rPr>
+                <w:rFonts w:asciiTheme="minorEastAsia" w:hAnsiTheme="minorEastAsia"/>
+                <w:sz w:val="20"/>
+                <w:szCs w:val="20"/>
+                <w:lang w:val="en-US"/>
+              </w:rPr>
+            </w:pPr>
+            <w:r>
+              <w:rPr>
+                <w:rFonts w:asciiTheme="minorEastAsia" w:hAnsiTheme="minorEastAsia"/>
+                <w:sz w:val="20"/>
+                <w:szCs w:val="20"/>
+                <w:lang w:val="en-US"/>
+              </w:rPr>
+              <w:t>5</w:t>
+            </w:r>
+          </w:p>
+        </w:tc>
+      </w:tr>
+      <w:tr>
+        <w:trPr>
+          <w:trHeight w:val="17"/>
+        </w:trPr>
+        <w:tc>
+          <w:tcPr>
+            <w:tcW w:w="0" w:type="auto"/>
+            <w:shd w:val="clear" w:color="auto" w:fill="FFFFFF"/>
+            <w:tcMar>
+              <w:top w:w="120" w:type="dxa"/>
+              <w:left w:w="210" w:type="dxa"/>
+              <w:bottom w:w="120" w:type="dxa"/>
+              <w:right w:w="210" w:type="dxa"/>
+            </w:tcMar>
+            <w:hideMark/>
+          </w:tcPr>
+          <w:p>
+            <w:pPr>
+              <w:pStyle w:val="Listenabsatz"/>
+              <w:numPr>
+                <w:ilvl w:val="0"/>
+                <w:numId w:val="2"/>
+              </w:numPr>
+              <w:spacing w:after="0" w:line="240" w:lineRule="auto"/>
+              <w:rPr>
+                <w:rFonts w:asciiTheme="minorEastAsia" w:hAnsiTheme="minorEastAsia"/>
+                <w:sz w:val="20"/>
+                <w:szCs w:val="20"/>
+                <w:lang w:val="en-US"/>
+              </w:rPr>
+            </w:pPr>
+            <w:r>
+              <w:rPr>
+                <w:rFonts w:asciiTheme="minorEastAsia" w:hAnsiTheme="minorEastAsia"/>
+                <w:sz w:val="20"/>
+                <w:szCs w:val="20"/>
+                <w:lang w:val="en-US"/>
+              </w:rPr>
+              <w:t xml:space="preserve">Coding Standard </w:t>
+            </w:r>
+            <w:r>
+              <w:rPr>
+                <w:rFonts w:asciiTheme="minorEastAsia" w:hAnsiTheme="minorEastAsia"/>
+                <w:sz w:val="20"/>
+                <w:szCs w:val="20"/>
+                <w:lang w:val="en-US"/>
+              </w:rPr>
+              <w:t>(Code specification</w:t>
+            </w:r>
+            <w:r>
+              <w:rPr>
+                <w:rFonts w:asciiTheme="minorEastAsia" w:hAnsiTheme="minorEastAsia"/>
+                <w:sz w:val="20"/>
+                <w:szCs w:val="20"/>
+                <w:lang w:val="en-US"/>
+              </w:rPr>
+              <w:t>,</w:t>
+            </w:r>
+            <w:r>
+              <w:rPr>
+                <w:rFonts w:asciiTheme="minorEastAsia" w:hAnsiTheme="minorEastAsia"/>
+                <w:sz w:val="20"/>
+                <w:szCs w:val="20"/>
+                <w:lang w:val="en-US"/>
+              </w:rPr>
+              <w:t xml:space="preserve"> develop appropriate specifications for current development)</w:t>
+            </w:r>
+          </w:p>
+        </w:tc>
+        <w:tc>
+          <w:tcPr>
+            <w:tcW w:w="0" w:type="auto"/>
+          </w:tcPr>
+          <w:p>
+            <w:pPr>
+              <w:spacing w:after="0" w:line="240" w:lineRule="auto"/>
+              <w:jc w:val="right"/>
+              <w:rPr>
+                <w:rFonts w:asciiTheme="minorEastAsia" w:hAnsiTheme="minorEastAsia"/>
+                <w:sz w:val="20"/>
+                <w:szCs w:val="20"/>
+                <w:lang w:val="en-US"/>
+              </w:rPr>
+            </w:pPr>
+            <w:r>
+              <w:rPr>
+                <w:rFonts w:asciiTheme="minorEastAsia" w:hAnsiTheme="minorEastAsia"/>
+                <w:sz w:val="20"/>
+                <w:szCs w:val="20"/>
+                <w:lang w:val="en-US"/>
+              </w:rPr>
+              <w:t>5</w:t>
+            </w:r>
+          </w:p>
+        </w:tc>
+        <w:tc>
+          <w:tcPr>
+            <w:tcW w:w="0" w:type="auto"/>
+          </w:tcPr>
+          <w:p>
+            <w:pPr>
+              <w:spacing w:after="0" w:line="240" w:lineRule="auto"/>
+              <w:jc w:val="right"/>
+              <w:rPr>
+                <w:rFonts w:asciiTheme="minorEastAsia" w:hAnsiTheme="minorEastAsia"/>
+                <w:sz w:val="20"/>
+                <w:szCs w:val="20"/>
+                <w:lang w:val="en-US"/>
+              </w:rPr>
+            </w:pPr>
+            <w:r>
+              <w:rPr>
+                <w:rFonts w:asciiTheme="minorEastAsia" w:hAnsiTheme="minorEastAsia"/>
+                <w:sz w:val="20"/>
+                <w:szCs w:val="20"/>
+                <w:lang w:val="en-US"/>
+              </w:rPr>
+              <w:t>5</w:t>
+            </w:r>
+          </w:p>
+        </w:tc>
+      </w:tr>
+      <w:tr>
+        <w:trPr>
+          <w:trHeight w:val="568"/>
+        </w:trPr>
+        <w:tc>
+          <w:tcPr>
+            <w:tcW w:w="0" w:type="auto"/>
+            <w:shd w:val="clear" w:color="auto" w:fill="FFFFFF"/>
+            <w:tcMar>
+              <w:top w:w="120" w:type="dxa"/>
+              <w:left w:w="210" w:type="dxa"/>
+              <w:bottom w:w="120" w:type="dxa"/>
+              <w:right w:w="210" w:type="dxa"/>
+            </w:tcMar>
+            <w:hideMark/>
+          </w:tcPr>
+          <w:p>
+            <w:pPr>
+              <w:pStyle w:val="Listenabsatz"/>
+              <w:numPr>
+                <w:ilvl w:val="0"/>
+                <w:numId w:val="2"/>
+              </w:numPr>
+              <w:spacing w:after="0" w:line="240" w:lineRule="auto"/>
+              <w:rPr>
+                <w:rFonts w:asciiTheme="minorEastAsia" w:hAnsiTheme="minorEastAsia"/>
+                <w:sz w:val="20"/>
+                <w:szCs w:val="20"/>
+                <w:lang w:val="en-US"/>
+              </w:rPr>
+            </w:pPr>
+            <w:r>
+              <w:rPr>
+                <w:rFonts w:asciiTheme="minorEastAsia" w:hAnsiTheme="minorEastAsia"/>
+                <w:sz w:val="20"/>
+                <w:szCs w:val="20"/>
+                <w:lang w:val="en-US"/>
+              </w:rPr>
+              <w:t xml:space="preserve">Design </w:t>
+            </w:r>
+            <w:r>
+              <w:rPr>
+                <w:rFonts w:asciiTheme="minorEastAsia" w:hAnsiTheme="minorEastAsia"/>
+                <w:sz w:val="20"/>
+                <w:szCs w:val="20"/>
+                <w:lang w:val="en-US"/>
+              </w:rPr>
+              <w:t>(detailed design)</w:t>
+            </w:r>
+          </w:p>
+        </w:tc>
+        <w:tc>
+          <w:tcPr>
+            <w:tcW w:w="0" w:type="auto"/>
+          </w:tcPr>
+          <w:p>
+            <w:pPr>
+              <w:spacing w:after="0" w:line="240" w:lineRule="auto"/>
+              <w:jc w:val="right"/>
+              <w:rPr>
+                <w:rFonts w:asciiTheme="minorEastAsia" w:hAnsiTheme="minorEastAsia"/>
+                <w:sz w:val="20"/>
+                <w:szCs w:val="20"/>
+                <w:lang w:val="en-US"/>
+              </w:rPr>
+            </w:pPr>
+            <w:r>
+              <w:rPr>
+                <w:rFonts w:asciiTheme="minorEastAsia" w:hAnsiTheme="minorEastAsia"/>
+                <w:sz w:val="20"/>
+                <w:szCs w:val="20"/>
+                <w:lang w:val="en-US"/>
+              </w:rPr>
+              <w:t>10</w:t>
+            </w:r>
+          </w:p>
+        </w:tc>
+        <w:tc>
+          <w:tcPr>
+            <w:tcW w:w="0" w:type="auto"/>
+          </w:tcPr>
+          <w:p>
+            <w:pPr>
+              <w:spacing w:after="0" w:line="240" w:lineRule="auto"/>
+              <w:jc w:val="right"/>
+              <w:rPr>
+                <w:rFonts w:asciiTheme="minorEastAsia" w:hAnsiTheme="minorEastAsia"/>
+                <w:sz w:val="20"/>
+                <w:szCs w:val="20"/>
+                <w:lang w:val="en-US"/>
+              </w:rPr>
+            </w:pPr>
+            <w:r>
+              <w:rPr>
+                <w:rFonts w:asciiTheme="minorEastAsia" w:hAnsiTheme="minorEastAsia"/>
+                <w:sz w:val="20"/>
+                <w:szCs w:val="20"/>
+                <w:lang w:val="en-US"/>
+              </w:rPr>
+              <w:t>10</w:t>
+            </w:r>
+          </w:p>
+        </w:tc>
+      </w:tr>
+      <w:tr>
+        <w:trPr>
+          <w:trHeight w:val="291"/>
+        </w:trPr>
+        <w:tc>
+          <w:tcPr>
+            <w:tcW w:w="0" w:type="auto"/>
+            <w:shd w:val="clear" w:color="auto" w:fill="FFFFFF"/>
+            <w:tcMar>
+              <w:top w:w="120" w:type="dxa"/>
+              <w:left w:w="210" w:type="dxa"/>
+              <w:bottom w:w="120" w:type="dxa"/>
+              <w:right w:w="210" w:type="dxa"/>
+            </w:tcMar>
+            <w:hideMark/>
+          </w:tcPr>
+          <w:p>
+            <w:pPr>
+              <w:pStyle w:val="Listenabsatz"/>
+              <w:numPr>
+                <w:ilvl w:val="0"/>
+                <w:numId w:val="2"/>
+              </w:numPr>
+              <w:spacing w:after="0" w:line="240" w:lineRule="auto"/>
+              <w:rPr>
+                <w:rFonts w:asciiTheme="minorEastAsia" w:hAnsiTheme="minorEastAsia"/>
+                <w:sz w:val="20"/>
+                <w:szCs w:val="20"/>
+                <w:lang w:val="en-US"/>
+              </w:rPr>
+            </w:pPr>
+            <w:r>
+              <w:rPr>
+                <w:rFonts w:asciiTheme="minorEastAsia" w:hAnsiTheme="minorEastAsia"/>
+                <w:sz w:val="20"/>
+                <w:szCs w:val="20"/>
+                <w:lang w:val="en-US"/>
+              </w:rPr>
+              <w:t>Coding</w:t>
+            </w:r>
+          </w:p>
+        </w:tc>
+        <w:tc>
+          <w:tcPr>
+            <w:tcW w:w="0" w:type="auto"/>
+          </w:tcPr>
+          <w:p>
+            <w:pPr>
+              <w:spacing w:after="0" w:line="240" w:lineRule="auto"/>
+              <w:jc w:val="right"/>
+              <w:rPr>
+                <w:rFonts w:asciiTheme="minorEastAsia" w:hAnsiTheme="minorEastAsia"/>
+                <w:sz w:val="20"/>
+                <w:szCs w:val="20"/>
+                <w:lang w:val="en-US"/>
+              </w:rPr>
+            </w:pPr>
+            <w:r>
+              <w:rPr>
+                <w:rFonts w:asciiTheme="minorEastAsia" w:hAnsiTheme="minorEastAsia"/>
+                <w:sz w:val="20"/>
+                <w:szCs w:val="20"/>
+                <w:lang w:val="en-US"/>
+              </w:rPr>
+              <w:t>30</w:t>
+            </w:r>
+          </w:p>
+        </w:tc>
+        <w:tc>
+          <w:tcPr>
+            <w:tcW w:w="0" w:type="auto"/>
+          </w:tcPr>
+          <w:p>
+            <w:pPr>
+              <w:spacing w:after="0" w:line="240" w:lineRule="auto"/>
+              <w:jc w:val="right"/>
+              <w:rPr>
+                <w:rFonts w:asciiTheme="minorEastAsia" w:hAnsiTheme="minorEastAsia"/>
+                <w:sz w:val="20"/>
+                <w:szCs w:val="20"/>
+                <w:lang w:val="en-US"/>
+              </w:rPr>
+            </w:pPr>
+            <w:r>
+              <w:rPr>
+                <w:rFonts w:asciiTheme="minorEastAsia" w:hAnsiTheme="minorEastAsia"/>
+                <w:sz w:val="20"/>
+                <w:szCs w:val="20"/>
+                <w:lang w:val="en-US"/>
+              </w:rPr>
+              <w:t>30</w:t>
+            </w:r>
+          </w:p>
+        </w:tc>
+      </w:tr>
+      <w:tr>
+        <w:trPr>
+          <w:trHeight w:val="17"/>
+        </w:trPr>
+        <w:tc>
+          <w:tcPr>
+            <w:tcW w:w="0" w:type="auto"/>
+            <w:shd w:val="clear" w:color="auto" w:fill="FFFFFF"/>
+            <w:tcMar>
+              <w:top w:w="120" w:type="dxa"/>
+              <w:left w:w="210" w:type="dxa"/>
+              <w:bottom w:w="120" w:type="dxa"/>
+              <w:right w:w="210" w:type="dxa"/>
+            </w:tcMar>
+            <w:hideMark/>
+          </w:tcPr>
+          <w:p>
+            <w:pPr>
+              <w:pStyle w:val="Listenabsatz"/>
+              <w:numPr>
+                <w:ilvl w:val="0"/>
+                <w:numId w:val="2"/>
+              </w:numPr>
+              <w:spacing w:after="0" w:line="240" w:lineRule="auto"/>
+              <w:rPr>
+                <w:rFonts w:asciiTheme="minorEastAsia" w:hAnsiTheme="minorEastAsia"/>
+                <w:sz w:val="20"/>
+                <w:szCs w:val="20"/>
+                <w:lang w:val="en-US"/>
+              </w:rPr>
+            </w:pPr>
+            <w:r>
+              <w:rPr>
+                <w:rFonts w:asciiTheme="minorEastAsia" w:hAnsiTheme="minorEastAsia"/>
+                <w:sz w:val="20"/>
+                <w:szCs w:val="20"/>
+                <w:lang w:val="en-US"/>
+              </w:rPr>
+              <w:t>Code Review</w:t>
+            </w:r>
+          </w:p>
+        </w:tc>
+        <w:tc>
+          <w:tcPr>
+            <w:tcW w:w="0" w:type="auto"/>
+          </w:tcPr>
+          <w:p>
+            <w:pPr>
+              <w:spacing w:after="0" w:line="240" w:lineRule="auto"/>
+              <w:jc w:val="right"/>
+              <w:rPr>
+                <w:rFonts w:asciiTheme="minorEastAsia" w:hAnsiTheme="minorEastAsia"/>
+                <w:sz w:val="20"/>
+                <w:szCs w:val="20"/>
+                <w:lang w:val="en-US"/>
+              </w:rPr>
+            </w:pPr>
+            <w:r>
+              <w:rPr>
+                <w:rFonts w:asciiTheme="minorEastAsia" w:hAnsiTheme="minorEastAsia"/>
+                <w:sz w:val="20"/>
+                <w:szCs w:val="20"/>
+                <w:lang w:val="en-US"/>
+              </w:rPr>
+              <w:t>15</w:t>
+            </w:r>
+          </w:p>
+        </w:tc>
+        <w:tc>
+          <w:tcPr>
+            <w:tcW w:w="0" w:type="auto"/>
+          </w:tcPr>
+          <w:p>
+            <w:pPr>
+              <w:spacing w:after="0" w:line="240" w:lineRule="auto"/>
+              <w:jc w:val="right"/>
+              <w:rPr>
+                <w:rFonts w:asciiTheme="minorEastAsia" w:hAnsiTheme="minorEastAsia"/>
+                <w:sz w:val="20"/>
+                <w:szCs w:val="20"/>
+                <w:lang w:val="en-US"/>
+              </w:rPr>
+            </w:pPr>
+            <w:r>
+              <w:rPr>
+                <w:rFonts w:asciiTheme="minorEastAsia" w:hAnsiTheme="minorEastAsia"/>
+                <w:sz w:val="20"/>
+                <w:szCs w:val="20"/>
+                <w:lang w:val="en-US"/>
+              </w:rPr>
+              <w:t>5</w:t>
+            </w:r>
+          </w:p>
+        </w:tc>
+      </w:tr>
+      <w:tr>
+        <w:trPr>
+          <w:trHeight w:val="17"/>
+        </w:trPr>
+        <w:tc>
+          <w:tcPr>
+            <w:tcW w:w="0" w:type="auto"/>
+            <w:shd w:val="clear" w:color="auto" w:fill="FFFFFF"/>
+            <w:tcMar>
+              <w:top w:w="120" w:type="dxa"/>
+              <w:left w:w="210" w:type="dxa"/>
+              <w:bottom w:w="120" w:type="dxa"/>
+              <w:right w:w="210" w:type="dxa"/>
+            </w:tcMar>
+            <w:hideMark/>
+          </w:tcPr>
+          <w:p>
+            <w:pPr>
+              <w:pStyle w:val="Listenabsatz"/>
+              <w:numPr>
+                <w:ilvl w:val="0"/>
+                <w:numId w:val="2"/>
+              </w:numPr>
+              <w:spacing w:after="0" w:line="240" w:lineRule="auto"/>
+              <w:rPr>
+                <w:rFonts w:asciiTheme="minorEastAsia" w:hAnsiTheme="minorEastAsia"/>
+                <w:sz w:val="20"/>
+                <w:szCs w:val="20"/>
+                <w:lang w:val="en-US"/>
+              </w:rPr>
+            </w:pPr>
+            <w:r>
+              <w:rPr>
+                <w:rFonts w:asciiTheme="minorEastAsia" w:hAnsiTheme="minorEastAsia"/>
+                <w:sz w:val="20"/>
+                <w:szCs w:val="20"/>
+                <w:lang w:val="en-US"/>
+              </w:rPr>
+              <w:t xml:space="preserve">Test </w:t>
+            </w:r>
+            <w:r>
+              <w:rPr>
+                <w:rFonts w:asciiTheme="minorEastAsia" w:hAnsiTheme="minorEastAsia"/>
+                <w:sz w:val="20"/>
+                <w:szCs w:val="20"/>
+                <w:lang w:val="en-US"/>
+              </w:rPr>
+              <w:t>(Testing self-testing, modifying code, submitting change</w:t>
+            </w:r>
+            <w:r>
+              <w:rPr>
+                <w:rFonts w:asciiTheme="minorEastAsia" w:hAnsiTheme="minorEastAsia"/>
+                <w:sz w:val="20"/>
+                <w:szCs w:val="20"/>
+                <w:lang w:val="en-US"/>
+              </w:rPr>
+              <w:t>s</w:t>
+            </w:r>
+            <w:r>
+              <w:rPr>
+                <w:rFonts w:asciiTheme="minorEastAsia" w:hAnsiTheme="minorEastAsia"/>
+                <w:sz w:val="20"/>
+                <w:szCs w:val="20"/>
+                <w:lang w:val="en-US"/>
+              </w:rPr>
+              <w:t>)</w:t>
+            </w:r>
+          </w:p>
+        </w:tc>
+        <w:tc>
+          <w:tcPr>
+            <w:tcW w:w="0" w:type="auto"/>
+          </w:tcPr>
+          <w:p>
+            <w:pPr>
+              <w:spacing w:after="0" w:line="240" w:lineRule="auto"/>
+              <w:jc w:val="right"/>
+              <w:rPr>
+                <w:rFonts w:asciiTheme="minorEastAsia" w:hAnsiTheme="minorEastAsia"/>
+                <w:sz w:val="20"/>
+                <w:szCs w:val="20"/>
+                <w:lang w:val="en-US"/>
+              </w:rPr>
+            </w:pPr>
+            <w:r>
+              <w:rPr>
+                <w:rFonts w:asciiTheme="minorEastAsia" w:hAnsiTheme="minorEastAsia"/>
+                <w:sz w:val="20"/>
+                <w:szCs w:val="20"/>
+                <w:lang w:val="en-US"/>
+              </w:rPr>
+              <w:t>30</w:t>
+            </w:r>
+          </w:p>
+        </w:tc>
+        <w:tc>
+          <w:tcPr>
+            <w:tcW w:w="0" w:type="auto"/>
+          </w:tcPr>
+          <w:p>
+            <w:pPr>
+              <w:spacing w:after="0" w:line="240" w:lineRule="auto"/>
+              <w:jc w:val="right"/>
+              <w:rPr>
+                <w:rFonts w:asciiTheme="minorEastAsia" w:hAnsiTheme="minorEastAsia"/>
+                <w:sz w:val="20"/>
+                <w:szCs w:val="20"/>
+                <w:lang w:val="en-US"/>
+              </w:rPr>
+            </w:pPr>
+            <w:r>
+              <w:rPr>
+                <w:rFonts w:asciiTheme="minorEastAsia" w:hAnsiTheme="minorEastAsia"/>
+                <w:sz w:val="20"/>
+                <w:szCs w:val="20"/>
+                <w:lang w:val="en-US"/>
+              </w:rPr>
+              <w:t>5</w:t>
+            </w:r>
+          </w:p>
+        </w:tc>
+      </w:tr>
+      <w:tr>
+        <w:trPr>
+          <w:trHeight w:val="17"/>
+        </w:trPr>
+        <w:tc>
+          <w:tcPr>
+            <w:tcW w:w="0" w:type="auto"/>
+            <w:shd w:val="clear" w:color="auto" w:fill="FFFFFF"/>
+            <w:tcMar>
+              <w:top w:w="120" w:type="dxa"/>
+              <w:left w:w="210" w:type="dxa"/>
+              <w:bottom w:w="120" w:type="dxa"/>
+              <w:right w:w="210" w:type="dxa"/>
+            </w:tcMar>
+            <w:hideMark/>
+          </w:tcPr>
+          <w:p>
+            <w:pPr>
+              <w:spacing w:after="0" w:line="240" w:lineRule="auto"/>
+              <w:rPr>
+                <w:rFonts w:asciiTheme="minorEastAsia" w:hAnsiTheme="minorEastAsia"/>
+                <w:i/>
+                <w:sz w:val="20"/>
+                <w:szCs w:val="20"/>
+                <w:lang w:val="en-US"/>
+              </w:rPr>
+            </w:pPr>
+            <w:r>
+              <w:rPr>
+                <w:rFonts w:asciiTheme="minorEastAsia" w:hAnsiTheme="minorEastAsia"/>
+                <w:i/>
+                <w:sz w:val="20"/>
+                <w:szCs w:val="20"/>
+                <w:lang w:val="en-US"/>
+              </w:rPr>
+              <w:t>Reporting</w:t>
+            </w:r>
+          </w:p>
+        </w:tc>
+        <w:tc>
+          <w:tcPr>
+            <w:tcW w:w="0" w:type="auto"/>
+          </w:tcPr>
+          <w:p>
+            <w:pPr>
+              <w:spacing w:after="0" w:line="240" w:lineRule="auto"/>
+              <w:jc w:val="right"/>
+              <w:rPr>
+                <w:rFonts w:asciiTheme="minorEastAsia" w:hAnsiTheme="minorEastAsia"/>
+                <w:sz w:val="20"/>
+                <w:szCs w:val="20"/>
+                <w:lang w:val="en-US"/>
+              </w:rPr>
+            </w:pPr>
+          </w:p>
+        </w:tc>
+        <w:tc>
+          <w:tcPr>
+            <w:tcW w:w="0" w:type="auto"/>
+          </w:tcPr>
+          <w:p>
+            <w:pPr>
+              <w:spacing w:after="0" w:line="240" w:lineRule="auto"/>
+              <w:jc w:val="right"/>
+              <w:rPr>
+                <w:rFonts w:asciiTheme="minorEastAsia" w:hAnsiTheme="minorEastAsia"/>
+                <w:sz w:val="20"/>
+                <w:szCs w:val="20"/>
+                <w:lang w:val="en-US"/>
+              </w:rPr>
+            </w:pPr>
+          </w:p>
+        </w:tc>
+      </w:tr>
+      <w:tr>
+        <w:trPr>
+          <w:trHeight w:val="17"/>
+        </w:trPr>
+        <w:tc>
+          <w:tcPr>
+            <w:tcW w:w="0" w:type="auto"/>
+            <w:shd w:val="clear" w:color="auto" w:fill="FFFFFF"/>
+            <w:tcMar>
+              <w:top w:w="120" w:type="dxa"/>
+              <w:left w:w="210" w:type="dxa"/>
+              <w:bottom w:w="120" w:type="dxa"/>
+              <w:right w:w="210" w:type="dxa"/>
+            </w:tcMar>
+            <w:hideMark/>
+          </w:tcPr>
+          <w:p>
+            <w:pPr>
+              <w:pStyle w:val="Listenabsatz"/>
+              <w:numPr>
+                <w:ilvl w:val="0"/>
+                <w:numId w:val="2"/>
+              </w:numPr>
+              <w:spacing w:after="0" w:line="240" w:lineRule="auto"/>
+              <w:rPr>
+                <w:rFonts w:asciiTheme="minorEastAsia" w:hAnsiTheme="minorEastAsia"/>
+                <w:sz w:val="20"/>
+                <w:szCs w:val="20"/>
+                <w:lang w:val="en-US"/>
+              </w:rPr>
+            </w:pPr>
+            <w:r>
+              <w:rPr>
+                <w:rFonts w:asciiTheme="minorEastAsia" w:hAnsiTheme="minorEastAsia"/>
+                <w:sz w:val="20"/>
+                <w:szCs w:val="20"/>
+                <w:lang w:val="en-US"/>
+              </w:rPr>
+              <w:t>Test Report</w:t>
+            </w:r>
+          </w:p>
+        </w:tc>
+        <w:tc>
+          <w:tcPr>
+            <w:tcW w:w="0" w:type="auto"/>
+          </w:tcPr>
+          <w:p>
+            <w:pPr>
+              <w:spacing w:after="0" w:line="240" w:lineRule="auto"/>
+              <w:jc w:val="right"/>
+              <w:rPr>
+                <w:rFonts w:asciiTheme="minorEastAsia" w:hAnsiTheme="minorEastAsia"/>
+                <w:sz w:val="20"/>
+                <w:szCs w:val="20"/>
+                <w:lang w:val="en-US"/>
+              </w:rPr>
+            </w:pPr>
+            <w:r>
+              <w:rPr>
+                <w:rFonts w:asciiTheme="minorEastAsia" w:hAnsiTheme="minorEastAsia"/>
+                <w:sz w:val="20"/>
+                <w:szCs w:val="20"/>
+                <w:lang w:val="en-US"/>
+              </w:rPr>
+              <w:t>90</w:t>
+            </w:r>
+          </w:p>
+        </w:tc>
+        <w:tc>
+          <w:tcPr>
+            <w:tcW w:w="0" w:type="auto"/>
+          </w:tcPr>
+          <w:p>
+            <w:pPr>
+              <w:spacing w:after="0" w:line="240" w:lineRule="auto"/>
+              <w:jc w:val="right"/>
+              <w:rPr>
+                <w:rFonts w:asciiTheme="minorEastAsia" w:hAnsiTheme="minorEastAsia"/>
+                <w:sz w:val="20"/>
+                <w:szCs w:val="20"/>
+                <w:lang w:val="en-US"/>
+              </w:rPr>
+            </w:pPr>
+            <w:r>
+              <w:rPr>
+                <w:rFonts w:asciiTheme="minorEastAsia" w:hAnsiTheme="minorEastAsia"/>
+                <w:sz w:val="20"/>
+                <w:szCs w:val="20"/>
+                <w:lang w:val="en-US"/>
+              </w:rPr>
+              <w:t>90</w:t>
+            </w:r>
+          </w:p>
+        </w:tc>
+      </w:tr>
+      <w:tr>
+        <w:trPr>
+          <w:trHeight w:val="17"/>
+        </w:trPr>
+        <w:tc>
+          <w:tcPr>
+            <w:tcW w:w="0" w:type="auto"/>
+            <w:shd w:val="clear" w:color="auto" w:fill="FFFFFF"/>
+            <w:tcMar>
+              <w:top w:w="120" w:type="dxa"/>
+              <w:left w:w="210" w:type="dxa"/>
+              <w:bottom w:w="120" w:type="dxa"/>
+              <w:right w:w="210" w:type="dxa"/>
+            </w:tcMar>
+            <w:hideMark/>
+          </w:tcPr>
+          <w:p>
+            <w:pPr>
+              <w:pStyle w:val="Listenabsatz"/>
+              <w:numPr>
+                <w:ilvl w:val="0"/>
+                <w:numId w:val="2"/>
+              </w:numPr>
+              <w:spacing w:after="0" w:line="240" w:lineRule="auto"/>
+              <w:rPr>
+                <w:rFonts w:asciiTheme="minorEastAsia" w:hAnsiTheme="minorEastAsia"/>
+                <w:sz w:val="20"/>
+                <w:szCs w:val="20"/>
+                <w:lang w:val="en-US"/>
+              </w:rPr>
+            </w:pPr>
+            <w:r>
+              <w:rPr>
+                <w:rFonts w:asciiTheme="minorEastAsia" w:hAnsiTheme="minorEastAsia"/>
+                <w:sz w:val="20"/>
+                <w:szCs w:val="20"/>
+                <w:lang w:val="en-US"/>
+              </w:rPr>
+              <w:t>Size Measurement</w:t>
+            </w:r>
+          </w:p>
+        </w:tc>
+        <w:tc>
+          <w:tcPr>
+            <w:tcW w:w="0" w:type="auto"/>
+          </w:tcPr>
+          <w:p>
+            <w:pPr>
+              <w:spacing w:after="0" w:line="240" w:lineRule="auto"/>
+              <w:jc w:val="right"/>
+              <w:rPr>
+                <w:rFonts w:asciiTheme="minorEastAsia" w:hAnsiTheme="minorEastAsia"/>
+                <w:sz w:val="20"/>
+                <w:szCs w:val="20"/>
+                <w:lang w:val="en-US"/>
+              </w:rPr>
+            </w:pPr>
+            <w:r>
+              <w:rPr>
+                <w:rFonts w:asciiTheme="minorEastAsia" w:hAnsiTheme="minorEastAsia"/>
+                <w:sz w:val="20"/>
+                <w:szCs w:val="20"/>
+                <w:lang w:val="en-US"/>
+              </w:rPr>
+              <w:t>?</w:t>
+            </w:r>
+          </w:p>
+        </w:tc>
+        <w:tc>
+          <w:tcPr>
+            <w:tcW w:w="0" w:type="auto"/>
+          </w:tcPr>
+          <w:p>
+            <w:pPr>
+              <w:spacing w:after="0" w:line="240" w:lineRule="auto"/>
+              <w:jc w:val="right"/>
+              <w:rPr>
+                <w:rFonts w:asciiTheme="minorEastAsia" w:hAnsiTheme="minorEastAsia"/>
+                <w:sz w:val="20"/>
+                <w:szCs w:val="20"/>
+                <w:lang w:val="en-US"/>
+              </w:rPr>
+            </w:pPr>
+            <w:r>
+              <w:rPr>
+                <w:rFonts w:asciiTheme="minorEastAsia" w:hAnsiTheme="minorEastAsia"/>
+                <w:sz w:val="20"/>
+                <w:szCs w:val="20"/>
+                <w:lang w:val="en-US"/>
+              </w:rPr>
+              <w:t>?</w:t>
+            </w:r>
+          </w:p>
+        </w:tc>
+      </w:tr>
+      <w:tr>
+        <w:trPr>
+          <w:trHeight w:val="17"/>
+        </w:trPr>
+        <w:tc>
+          <w:tcPr>
+            <w:tcW w:w="0" w:type="auto"/>
+            <w:shd w:val="clear" w:color="auto" w:fill="FFFFFF"/>
+            <w:tcMar>
+              <w:top w:w="120" w:type="dxa"/>
+              <w:left w:w="210" w:type="dxa"/>
+              <w:bottom w:w="120" w:type="dxa"/>
+              <w:right w:w="210" w:type="dxa"/>
+            </w:tcMar>
+            <w:hideMark/>
+          </w:tcPr>
+          <w:p>
+            <w:pPr>
+              <w:pStyle w:val="Listenabsatz"/>
+              <w:numPr>
+                <w:ilvl w:val="0"/>
+                <w:numId w:val="2"/>
+              </w:numPr>
+              <w:spacing w:after="0" w:line="240" w:lineRule="auto"/>
+              <w:rPr>
+                <w:rFonts w:asciiTheme="minorEastAsia" w:hAnsiTheme="minorEastAsia"/>
+                <w:sz w:val="20"/>
+                <w:szCs w:val="20"/>
+                <w:lang w:val="en-US"/>
+              </w:rPr>
+            </w:pPr>
+            <w:r>
+              <w:rPr>
+                <w:rFonts w:asciiTheme="minorEastAsia" w:hAnsiTheme="minorEastAsia"/>
+                <w:sz w:val="20"/>
+                <w:szCs w:val="20"/>
+                <w:lang w:val="en-US"/>
+              </w:rPr>
+              <w:t>Postmortem &amp; Process Improvement Plan</w:t>
+            </w:r>
+          </w:p>
+        </w:tc>
+        <w:tc>
+          <w:tcPr>
+            <w:tcW w:w="0" w:type="auto"/>
+          </w:tcPr>
+          <w:p>
+            <w:pPr>
+              <w:spacing w:after="0" w:line="240" w:lineRule="auto"/>
+              <w:jc w:val="right"/>
+              <w:rPr>
+                <w:rFonts w:asciiTheme="minorEastAsia" w:hAnsiTheme="minorEastAsia"/>
+                <w:sz w:val="20"/>
+                <w:szCs w:val="20"/>
+                <w:lang w:val="en-US"/>
+              </w:rPr>
+            </w:pPr>
+            <w:r>
+              <w:rPr>
+                <w:rFonts w:asciiTheme="minorEastAsia" w:hAnsiTheme="minorEastAsia"/>
+                <w:sz w:val="20"/>
+                <w:szCs w:val="20"/>
+                <w:lang w:val="en-US"/>
+              </w:rPr>
+              <w:t>?</w:t>
+            </w:r>
+          </w:p>
+        </w:tc>
+        <w:tc>
+          <w:tcPr>
+            <w:tcW w:w="0" w:type="auto"/>
+          </w:tcPr>
+          <w:p>
+            <w:pPr>
+              <w:spacing w:after="0" w:line="240" w:lineRule="auto"/>
+              <w:jc w:val="right"/>
+              <w:rPr>
+                <w:rFonts w:asciiTheme="minorEastAsia" w:hAnsiTheme="minorEastAsia"/>
+                <w:sz w:val="20"/>
+                <w:szCs w:val="20"/>
+                <w:lang w:val="en-US"/>
+              </w:rPr>
+            </w:pPr>
+            <w:r>
+              <w:rPr>
+                <w:rFonts w:asciiTheme="minorEastAsia" w:hAnsiTheme="minorEastAsia"/>
+                <w:sz w:val="20"/>
+                <w:szCs w:val="20"/>
+                <w:lang w:val="en-US"/>
+              </w:rPr>
+              <w:t>?</w:t>
+            </w:r>
+          </w:p>
+        </w:tc>
+      </w:tr>
+    </w:tbl>
     <w:p>
       <w:pPr>
         <w:jc w:val="both"/>
         <w:rPr>
           <w:rFonts w:asciiTheme="minorEastAsia" w:hAnsiTheme="minorEastAsia"/>
-          <w:lang w:val="en-US"/>
-        </w:rPr>
-      </w:pPr>
-      <w:r>
-        <w:rPr>
-          <w:rFonts w:asciiTheme="minorEastAsia" w:hAnsiTheme="minorEastAsia"/>
-          <w:lang w:val="en-US"/>
-        </w:rPr>
-        <w:t xml:space="preserve">Furthermore, we are aware of the challenging gap between development and production of a software </w:t>
-      </w:r>
-      <w:r>
-        <w:rPr>
-          <w:rFonts w:asciiTheme="minorEastAsia" w:hAnsiTheme="minorEastAsia"/>
-          <w:lang w:val="en-US"/>
-        </w:rPr>
-        <w:t>product,</w:t>
-      </w:r>
-      <w:r>
-        <w:rPr>
-          <w:rFonts w:asciiTheme="minorEastAsia" w:hAnsiTheme="minorEastAsia"/>
-          <w:lang w:val="en-US"/>
-        </w:rPr>
-        <w:t xml:space="preserve"> and we will try to bridge th</w:t>
-      </w:r>
-      <w:r>
-        <w:rPr>
-          <w:rFonts w:asciiTheme="minorEastAsia" w:hAnsiTheme="minorEastAsia"/>
-          <w:lang w:val="en-US"/>
-        </w:rPr>
-        <w:t>is</w:t>
-      </w:r>
-      <w:r>
-        <w:rPr>
-          <w:rFonts w:asciiTheme="minorEastAsia" w:hAnsiTheme="minorEastAsia"/>
-          <w:lang w:val="en-US"/>
-        </w:rPr>
-        <w:t xml:space="preserve"> gap by continuous deployment</w:t>
-      </w:r>
-      <w:r>
-        <w:rPr>
-          <w:rFonts w:asciiTheme="minorEastAsia" w:hAnsiTheme="minorEastAsia"/>
-          <w:lang w:val="en-US"/>
-        </w:rPr>
-        <w:t>. Therefore, choosing a suitable software process model and executing it are considered key success factors by us.</w:t>
-      </w:r>
-    </w:p>
-    <w:p>
-      <w:pPr>
-        <w:jc w:val="both"/>
-        <w:rPr>
-          <w:rFonts w:asciiTheme="minorEastAsia" w:hAnsiTheme="minorEastAsia"/>
-          <w:lang w:val="en-US"/>
-        </w:rPr>
-      </w:pPr>
-    </w:p>
-    <w:p>
-      <w:pPr>
-        <w:pStyle w:val="Listenabsatz"/>
-        <w:numPr>
-          <w:ilvl w:val="1"/>
-          <w:numId w:val="1"/>
-        </w:numPr>
-        <w:rPr>
-          <w:rFonts w:asciiTheme="minorEastAsia" w:hAnsiTheme="minorEastAsia"/>
           <w:b/>
-          <w:i/>
-          <w:lang w:val="en-US"/>
-        </w:rPr>
-      </w:pPr>
-      <w:r>
-        <w:rPr>
-          <w:rFonts w:asciiTheme="minorEastAsia" w:hAnsiTheme="minorEastAsia"/>
-          <w:i/>
-          <w:lang w:val="en-US"/>
-        </w:rPr>
-        <w:t xml:space="preserve">What’re </w:t>
-      </w:r>
-      <w:r>
-        <w:rPr>
-          <w:rFonts w:asciiTheme="minorEastAsia" w:hAnsiTheme="minorEastAsia"/>
-          <w:i/>
-          <w:lang w:val="en-US"/>
-        </w:rPr>
-        <w:t xml:space="preserve">your </w:t>
-      </w:r>
-      <w:r>
-        <w:rPr>
-          <w:rFonts w:asciiTheme="minorEastAsia" w:hAnsiTheme="minorEastAsia"/>
-          <w:i/>
-          <w:lang w:val="en-US"/>
-        </w:rPr>
-        <w:t>experience and lessons</w:t>
-      </w:r>
-      <w:r>
-        <w:rPr>
-          <w:rFonts w:asciiTheme="minorEastAsia" w:hAnsiTheme="minorEastAsia"/>
-          <w:i/>
-          <w:lang w:val="en-US"/>
-        </w:rPr>
-        <w:t xml:space="preserve"> </w:t>
-      </w:r>
-      <w:r>
-        <w:rPr>
-          <w:rFonts w:asciiTheme="minorEastAsia" w:hAnsiTheme="minorEastAsia"/>
-          <w:i/>
-          <w:lang w:val="en-US"/>
-        </w:rPr>
-        <w:t>during their software development project?</w:t>
-      </w:r>
-    </w:p>
-    <w:p>
-      <w:pPr>
-        <w:jc w:val="both"/>
-        <w:rPr>
-          <w:rFonts w:asciiTheme="minorEastAsia" w:hAnsiTheme="minorEastAsia"/>
-          <w:lang w:val="en-US"/>
-        </w:rPr>
-      </w:pPr>
-      <w:r>
-        <w:rPr>
-          <w:rFonts w:asciiTheme="minorEastAsia" w:hAnsiTheme="minorEastAsia"/>
-          <w:lang w:val="en-US"/>
-        </w:rPr>
-        <w:t xml:space="preserve">Amedeo and Thierry reported that </w:t>
-      </w:r>
-      <w:r>
-        <w:rPr>
-          <w:rFonts w:asciiTheme="minorEastAsia" w:hAnsiTheme="minorEastAsia"/>
-          <w:b/>
-          <w:lang w:val="en-US"/>
-        </w:rPr>
-        <w:t>teamwork</w:t>
-      </w:r>
-      <w:r>
-        <w:rPr>
-          <w:rFonts w:asciiTheme="minorEastAsia" w:hAnsiTheme="minorEastAsia"/>
-          <w:lang w:val="en-US"/>
-        </w:rPr>
-        <w:t xml:space="preserve"> played a crucial role in the project’s success. They learned how to coordinate with each other, split the work and create suitable workflows. We concluded from their final report (user manual) that they used an agile process model and developed the app in three cycles. </w:t>
-      </w:r>
-      <w:r>
-        <w:rPr>
-          <w:rFonts w:asciiTheme="minorEastAsia" w:hAnsiTheme="minorEastAsia"/>
-          <w:lang w:val="en-US"/>
-        </w:rPr>
-        <w:t>In our project, we will focus on clear responsibilities within our team and employ to make our teamwork more efficient.</w:t>
-      </w:r>
-    </w:p>
-    <w:p>
-      <w:pPr>
-        <w:jc w:val="both"/>
-        <w:rPr>
-          <w:rFonts w:asciiTheme="minorEastAsia" w:hAnsiTheme="minorEastAsia"/>
-          <w:lang w:val="en-US"/>
-        </w:rPr>
-      </w:pPr>
-      <w:r>
-        <w:rPr>
-          <w:rFonts w:asciiTheme="minorEastAsia" w:hAnsiTheme="minorEastAsia"/>
-          <w:lang w:val="en-US"/>
-        </w:rPr>
-        <w:t xml:space="preserve">They </w:t>
-      </w:r>
-      <w:r>
-        <w:rPr>
-          <w:rFonts w:asciiTheme="minorEastAsia" w:hAnsiTheme="minorEastAsia"/>
-          <w:lang w:val="en-US"/>
-        </w:rPr>
-        <w:t xml:space="preserve">also </w:t>
-      </w:r>
-      <w:r>
-        <w:rPr>
-          <w:rFonts w:asciiTheme="minorEastAsia" w:hAnsiTheme="minorEastAsia"/>
-          <w:lang w:val="en-US"/>
-        </w:rPr>
-        <w:t xml:space="preserve">highlighted the amount of work and steps it takes </w:t>
-      </w:r>
-      <w:r>
-        <w:rPr>
-          <w:rFonts w:asciiTheme="minorEastAsia" w:hAnsiTheme="minorEastAsia"/>
-          <w:b/>
-          <w:lang w:val="en-US"/>
-        </w:rPr>
-        <w:t>before the start of the</w:t>
-      </w:r>
-      <w:r>
-        <w:rPr>
-          <w:rFonts w:asciiTheme="minorEastAsia" w:hAnsiTheme="minorEastAsia"/>
-          <w:lang w:val="en-US"/>
-        </w:rPr>
-        <w:t xml:space="preserve"> </w:t>
-      </w:r>
-      <w:r>
-        <w:rPr>
-          <w:rFonts w:asciiTheme="minorEastAsia" w:hAnsiTheme="minorEastAsia"/>
-          <w:b/>
-          <w:lang w:val="en-US"/>
-        </w:rPr>
-        <w:t>implementation</w:t>
-      </w:r>
-      <w:r>
-        <w:rPr>
-          <w:rFonts w:asciiTheme="minorEastAsia" w:hAnsiTheme="minorEastAsia"/>
-          <w:lang w:val="en-US"/>
-        </w:rPr>
-        <w:t xml:space="preserve">. </w:t>
-      </w:r>
-      <w:r>
-        <w:rPr>
-          <w:rFonts w:asciiTheme="minorEastAsia" w:hAnsiTheme="minorEastAsia"/>
-          <w:lang w:val="en-US"/>
-        </w:rPr>
-        <w:t xml:space="preserve">We see that reflected in the number of requirements, and the number of models, such as data models, UML diagrams, data flow diagrams, and many more, that the two developers provide in their report. This demonstrates how versatile software engineering tasks are and it showed us that we should not save time on this step in our own software project but embrace it. We learned that </w:t>
-      </w:r>
-      <w:r>
-        <w:rPr>
-          <w:rFonts w:asciiTheme="minorEastAsia" w:hAnsiTheme="minorEastAsia"/>
-          <w:lang w:val="en-US"/>
-        </w:rPr>
-        <w:t xml:space="preserve">solid </w:t>
-      </w:r>
-      <w:r>
-        <w:rPr>
-          <w:rFonts w:asciiTheme="minorEastAsia" w:hAnsiTheme="minorEastAsia"/>
-          <w:lang w:val="en-US"/>
-        </w:rPr>
-        <w:t xml:space="preserve">planning and modeling is the foundation of a </w:t>
-      </w:r>
-      <w:r>
-        <w:rPr>
-          <w:rFonts w:asciiTheme="minorEastAsia" w:hAnsiTheme="minorEastAsia"/>
-          <w:lang w:val="en-US"/>
-        </w:rPr>
-        <w:t>good software product.</w:t>
-      </w:r>
-    </w:p>
-    <w:p>
-      <w:pPr>
-        <w:rPr>
-          <w:rFonts w:asciiTheme="minorEastAsia" w:hAnsiTheme="minorEastAsia"/>
-          <w:b/>
-          <w:lang w:val="en-US"/>
-        </w:rPr>
-      </w:pPr>
-    </w:p>
-    <w:p>
-      <w:pPr>
-        <w:rPr>
-          <w:rFonts w:asciiTheme="minorEastAsia" w:hAnsiTheme="minorEastAsia"/>
-          <w:b/>
-          <w:lang w:val="en-US"/>
-        </w:rPr>
-      </w:pPr>
-    </w:p>
-    <w:p>
-      <w:pPr>
-        <w:rPr>
-          <w:rFonts w:asciiTheme="minorEastAsia" w:hAnsiTheme="minorEastAsia"/>
-          <w:b/>
-          <w:lang w:val="en-US"/>
-        </w:rPr>
-      </w:pPr>
-    </w:p>
-    <w:p>
-      <w:pPr>
-        <w:ind w:left="567" w:right="567"/>
-        <w:jc w:val="center"/>
-        <w:rPr>
-          <w:i/>
-          <w:iCs/>
-          <w:noProof/>
-          <w:lang w:val="en-US"/>
-        </w:rPr>
-      </w:pPr>
-      <w:r>
-        <w:rPr>
-          <w:i/>
-          <w:iCs/>
-          <w:noProof/>
-          <w:sz w:val="22"/>
-          <w:szCs w:val="22"/>
-        </w:rPr>
-        <w:lastRenderedPageBreak/>
-        <w:drawing>
-          <wp:anchor distT="0" distB="0" distL="114300" distR="114300" simplePos="0" relativeHeight="251666432" behindDoc="0" locked="0" layoutInCell="1" allowOverlap="1" wp14:anchorId="7F0B7E27" wp14:editId="15884BE9">
-            <wp:simplePos x="0" y="0"/>
-            <wp:positionH relativeFrom="margin">
-              <wp:align>right</wp:align>
-            </wp:positionH>
-            <wp:positionV relativeFrom="paragraph">
-              <wp:posOffset>15396</wp:posOffset>
-            </wp:positionV>
-            <wp:extent cx="1956177" cy="2160000"/>
-            <wp:effectExtent l="0" t="0" r="6350" b="0"/>
-            <wp:wrapNone/>
-            <wp:docPr id="279735853" name="Grafik 1"/>
-            <wp:cNvGraphicFramePr>
-              <a:graphicFrameLocks xmlns:a="http://schemas.openxmlformats.org/drawingml/2006/main" noChangeAspect="1"/>
-            </wp:cNvGraphicFramePr>
-            <a:graphic xmlns:a="http://schemas.openxmlformats.org/drawingml/2006/main">
-              <a:graphicData uri="http://schemas.openxmlformats.org/drawingml/2006/picture">
-                <pic:pic xmlns:pic="http://schemas.openxmlformats.org/drawingml/2006/picture">
-                  <pic:nvPicPr>
-                    <pic:cNvPr id="279735853" name=""/>
-                    <pic:cNvPicPr/>
-                  </pic:nvPicPr>
-                  <pic:blipFill>
-                    <a:blip r:embed="rId13" cstate="print">
-                      <a:extLst>
-                        <a:ext uri="{28A0092B-C50C-407E-A947-70E740481C1C}">
-                          <a14:useLocalDpi xmlns:a14="http://schemas.microsoft.com/office/drawing/2010/main" val="0"/>
-                        </a:ext>
-                      </a:extLst>
-                    </a:blip>
-                    <a:stretch>
-                      <a:fillRect/>
-                    </a:stretch>
-                  </pic:blipFill>
-                  <pic:spPr>
-                    <a:xfrm>
-                      <a:off x="0" y="0"/>
-                      <a:ext cx="1956177" cy="2160000"/>
-                    </a:xfrm>
-                    <a:prstGeom prst="rect">
-                      <a:avLst/>
-                    </a:prstGeom>
-                  </pic:spPr>
-                </pic:pic>
-              </a:graphicData>
-            </a:graphic>
-            <wp14:sizeRelH relativeFrom="margin">
-              <wp14:pctWidth>0</wp14:pctWidth>
-            </wp14:sizeRelH>
-            <wp14:sizeRelV relativeFrom="margin">
-              <wp14:pctHeight>0</wp14:pctHeight>
-            </wp14:sizeRelV>
-          </wp:anchor>
-        </w:drawing>
-      </w:r>
-      <w:r>
-        <w:rPr>
-          <w:rFonts w:asciiTheme="minorEastAsia" w:hAnsiTheme="minorEastAsia"/>
-          <w:i/>
-          <w:iCs/>
-          <w:noProof/>
-          <w:sz w:val="22"/>
-          <w:szCs w:val="22"/>
-          <w:lang w:val="en-US"/>
-        </w:rPr>
-        <w:drawing>
-          <wp:anchor distT="0" distB="0" distL="114300" distR="114300" simplePos="0" relativeHeight="251665408" behindDoc="1" locked="0" layoutInCell="1" allowOverlap="1" wp14:anchorId="7ADBB695" wp14:editId="59F87660">
-            <wp:simplePos x="0" y="0"/>
-            <wp:positionH relativeFrom="margin">
-              <wp:posOffset>1993265</wp:posOffset>
-            </wp:positionH>
-            <wp:positionV relativeFrom="paragraph">
-              <wp:posOffset>635</wp:posOffset>
-            </wp:positionV>
-            <wp:extent cx="1515161" cy="2160000"/>
-            <wp:effectExtent l="0" t="0" r="8890" b="0"/>
-            <wp:wrapNone/>
-            <wp:docPr id="701274386" name="Grafik 1"/>
-            <wp:cNvGraphicFramePr>
-              <a:graphicFrameLocks xmlns:a="http://schemas.openxmlformats.org/drawingml/2006/main" noChangeAspect="1"/>
-            </wp:cNvGraphicFramePr>
-            <a:graphic xmlns:a="http://schemas.openxmlformats.org/drawingml/2006/main">
-              <a:graphicData uri="http://schemas.openxmlformats.org/drawingml/2006/picture">
-                <pic:pic xmlns:pic="http://schemas.openxmlformats.org/drawingml/2006/picture">
-                  <pic:nvPicPr>
-                    <pic:cNvPr id="701274386" name=""/>
-                    <pic:cNvPicPr/>
-                  </pic:nvPicPr>
-                  <pic:blipFill>
-                    <a:blip r:embed="rId14" cstate="print">
-                      <a:extLst>
-                        <a:ext uri="{28A0092B-C50C-407E-A947-70E740481C1C}">
-                          <a14:useLocalDpi xmlns:a14="http://schemas.microsoft.com/office/drawing/2010/main" val="0"/>
-                        </a:ext>
-                      </a:extLst>
-                    </a:blip>
-                    <a:stretch>
-                      <a:fillRect/>
-                    </a:stretch>
-                  </pic:blipFill>
-                  <pic:spPr>
-                    <a:xfrm>
-                      <a:off x="0" y="0"/>
-                      <a:ext cx="1515161" cy="2160000"/>
-                    </a:xfrm>
-                    <a:prstGeom prst="rect">
-                      <a:avLst/>
-                    </a:prstGeom>
-                  </pic:spPr>
-                </pic:pic>
-              </a:graphicData>
-            </a:graphic>
-            <wp14:sizeRelH relativeFrom="margin">
-              <wp14:pctWidth>0</wp14:pctWidth>
-            </wp14:sizeRelH>
-            <wp14:sizeRelV relativeFrom="margin">
-              <wp14:pctHeight>0</wp14:pctHeight>
-            </wp14:sizeRelV>
-          </wp:anchor>
-        </w:drawing>
-      </w:r>
-      <w:r>
-        <w:rPr>
-          <w:rFonts w:asciiTheme="minorEastAsia" w:hAnsiTheme="minorEastAsia"/>
-          <w:b/>
-          <w:i/>
-          <w:iCs/>
-          <w:noProof/>
-          <w:sz w:val="22"/>
-          <w:szCs w:val="22"/>
-          <w:lang w:val="en-US"/>
-        </w:rPr>
-        <w:drawing>
-          <wp:anchor distT="0" distB="0" distL="114300" distR="114300" simplePos="0" relativeHeight="251664384" behindDoc="0" locked="0" layoutInCell="1" allowOverlap="1" wp14:anchorId="2BE231A5" wp14:editId="1F974895">
-            <wp:simplePos x="0" y="0"/>
-            <wp:positionH relativeFrom="margin">
-              <wp:align>left</wp:align>
-            </wp:positionH>
-            <wp:positionV relativeFrom="paragraph">
-              <wp:posOffset>322</wp:posOffset>
-            </wp:positionV>
-            <wp:extent cx="1896449" cy="2160000"/>
-            <wp:effectExtent l="0" t="0" r="8890" b="0"/>
-            <wp:wrapTopAndBottom/>
-            <wp:docPr id="1233437279" name="Grafik 1"/>
-            <wp:cNvGraphicFramePr>
-              <a:graphicFrameLocks xmlns:a="http://schemas.openxmlformats.org/drawingml/2006/main" noChangeAspect="1"/>
-            </wp:cNvGraphicFramePr>
-            <a:graphic xmlns:a="http://schemas.openxmlformats.org/drawingml/2006/main">
-              <a:graphicData uri="http://schemas.openxmlformats.org/drawingml/2006/picture">
-                <pic:pic xmlns:pic="http://schemas.openxmlformats.org/drawingml/2006/picture">
-                  <pic:nvPicPr>
-                    <pic:cNvPr id="1233437279" name=""/>
-                    <pic:cNvPicPr/>
-                  </pic:nvPicPr>
-                  <pic:blipFill>
-                    <a:blip r:embed="rId15" cstate="print">
-                      <a:extLst>
-                        <a:ext uri="{28A0092B-C50C-407E-A947-70E740481C1C}">
-                          <a14:useLocalDpi xmlns:a14="http://schemas.microsoft.com/office/drawing/2010/main" val="0"/>
-                        </a:ext>
-                      </a:extLst>
-                    </a:blip>
-                    <a:stretch>
-                      <a:fillRect/>
-                    </a:stretch>
-                  </pic:blipFill>
-                  <pic:spPr>
-                    <a:xfrm>
-                      <a:off x="0" y="0"/>
-                      <a:ext cx="1896449" cy="2160000"/>
-                    </a:xfrm>
-                    <a:prstGeom prst="rect">
-                      <a:avLst/>
-                    </a:prstGeom>
-                  </pic:spPr>
-                </pic:pic>
-              </a:graphicData>
-            </a:graphic>
-            <wp14:sizeRelH relativeFrom="margin">
-              <wp14:pctWidth>0</wp14:pctWidth>
-            </wp14:sizeRelH>
-            <wp14:sizeRelV relativeFrom="margin">
-              <wp14:pctHeight>0</wp14:pctHeight>
-            </wp14:sizeRelV>
-          </wp:anchor>
-        </w:drawing>
-      </w:r>
-      <w:r>
-        <w:rPr>
-          <w:rFonts w:asciiTheme="minorEastAsia" w:hAnsiTheme="minorEastAsia"/>
-          <w:i/>
-          <w:iCs/>
-          <w:sz w:val="22"/>
-          <w:szCs w:val="22"/>
-          <w:lang w:val="en-US"/>
-        </w:rPr>
-        <w:t xml:space="preserve">Figure 2: The use case diagram, an Entity-Relationship Diagram (ER-diagram), and activity diagram from the </w:t>
-      </w:r>
-      <w:proofErr w:type="spellStart"/>
-      <w:r>
-        <w:rPr>
-          <w:rFonts w:asciiTheme="minorEastAsia" w:hAnsiTheme="minorEastAsia"/>
-          <w:i/>
-          <w:iCs/>
-          <w:sz w:val="22"/>
-          <w:szCs w:val="22"/>
-          <w:lang w:val="en-US"/>
-        </w:rPr>
-        <w:t>XianZai</w:t>
-      </w:r>
-      <w:proofErr w:type="spellEnd"/>
-      <w:r>
-        <w:rPr>
-          <w:rFonts w:asciiTheme="minorEastAsia" w:hAnsiTheme="minorEastAsia"/>
-          <w:i/>
-          <w:iCs/>
-          <w:sz w:val="22"/>
-          <w:szCs w:val="22"/>
-          <w:lang w:val="en-US"/>
-        </w:rPr>
-        <w:t xml:space="preserve"> projects’ final report (user manual) which highlight the amount of conceptional tasks necessary in a software project. </w:t>
-      </w:r>
-    </w:p>
-    <w:p>
-      <w:pPr>
-        <w:rPr>
-          <w:rFonts w:asciiTheme="minorEastAsia" w:hAnsiTheme="minorEastAsia"/>
-          <w:b/>
-          <w:i/>
-          <w:lang w:val="en-US"/>
-        </w:rPr>
-      </w:pPr>
-    </w:p>
-    <w:p>
-      <w:pPr>
-        <w:pStyle w:val="Listenabsatz"/>
-        <w:numPr>
-          <w:ilvl w:val="1"/>
-          <w:numId w:val="1"/>
-        </w:numPr>
-        <w:rPr>
-          <w:rFonts w:asciiTheme="minorEastAsia" w:hAnsiTheme="minorEastAsia"/>
-          <w:b/>
-          <w:i/>
-          <w:lang w:val="en-US"/>
-        </w:rPr>
-      </w:pPr>
-      <w:r>
-        <w:rPr>
-          <w:rFonts w:asciiTheme="minorEastAsia" w:hAnsiTheme="minorEastAsia"/>
-          <w:i/>
-          <w:lang w:val="en-US"/>
-        </w:rPr>
-        <w:t>What</w:t>
-      </w:r>
-      <w:r>
-        <w:rPr>
-          <w:rFonts w:asciiTheme="minorEastAsia" w:hAnsiTheme="minorEastAsia"/>
-          <w:i/>
-          <w:lang w:val="en-US"/>
-        </w:rPr>
-        <w:t xml:space="preserve"> ar</w:t>
-      </w:r>
-      <w:r>
-        <w:rPr>
-          <w:rFonts w:asciiTheme="minorEastAsia" w:hAnsiTheme="minorEastAsia"/>
-          <w:i/>
-          <w:lang w:val="en-US"/>
-        </w:rPr>
-        <w:t xml:space="preserve">e </w:t>
-      </w:r>
-      <w:r>
-        <w:rPr>
-          <w:rFonts w:asciiTheme="minorEastAsia" w:hAnsiTheme="minorEastAsia"/>
-          <w:i/>
-          <w:lang w:val="en-US"/>
-        </w:rPr>
-        <w:t xml:space="preserve">your </w:t>
-      </w:r>
-      <w:r>
-        <w:rPr>
-          <w:rFonts w:asciiTheme="minorEastAsia" w:hAnsiTheme="minorEastAsia"/>
-          <w:i/>
-          <w:lang w:val="en-US"/>
-        </w:rPr>
-        <w:t>recommendation</w:t>
-      </w:r>
-      <w:r>
-        <w:rPr>
-          <w:rFonts w:asciiTheme="minorEastAsia" w:hAnsiTheme="minorEastAsia"/>
-          <w:i/>
-          <w:lang w:val="en-US"/>
-        </w:rPr>
-        <w:t>s</w:t>
-      </w:r>
-      <w:r>
-        <w:rPr>
-          <w:rFonts w:asciiTheme="minorEastAsia" w:hAnsiTheme="minorEastAsia"/>
-          <w:i/>
-          <w:lang w:val="en-US"/>
-        </w:rPr>
-        <w:t xml:space="preserve"> </w:t>
-      </w:r>
-      <w:r>
-        <w:rPr>
-          <w:rFonts w:asciiTheme="minorEastAsia" w:hAnsiTheme="minorEastAsia"/>
-          <w:i/>
-          <w:lang w:val="en-US"/>
-        </w:rPr>
-        <w:t>for</w:t>
-      </w:r>
-      <w:r>
-        <w:rPr>
-          <w:rFonts w:asciiTheme="minorEastAsia" w:hAnsiTheme="minorEastAsia"/>
-          <w:i/>
-          <w:lang w:val="en-US"/>
-        </w:rPr>
-        <w:t xml:space="preserve"> learning this course?</w:t>
-      </w:r>
-    </w:p>
-    <w:p>
-      <w:pPr>
-        <w:jc w:val="both"/>
-        <w:rPr>
-          <w:rFonts w:asciiTheme="minorEastAsia" w:hAnsiTheme="minorEastAsia"/>
-          <w:lang w:val="en-US"/>
-        </w:rPr>
-      </w:pPr>
-      <w:r>
-        <w:rPr>
-          <w:rFonts w:asciiTheme="minorEastAsia" w:hAnsiTheme="minorEastAsia"/>
-          <w:lang w:val="en-US"/>
-        </w:rPr>
-        <w:t xml:space="preserve">First, Amedeo and Thierry suggested that we think of an </w:t>
-      </w:r>
-      <w:r>
-        <w:rPr>
-          <w:rFonts w:asciiTheme="minorEastAsia" w:hAnsiTheme="minorEastAsia"/>
-          <w:b/>
-          <w:lang w:val="en-US"/>
-        </w:rPr>
-        <w:t>original idea</w:t>
-      </w:r>
-      <w:r>
-        <w:rPr>
-          <w:rFonts w:asciiTheme="minorEastAsia" w:hAnsiTheme="minorEastAsia"/>
-          <w:lang w:val="en-US"/>
-        </w:rPr>
-        <w:t xml:space="preserve"> for our project. The idea should be sellable to actual customers and have a good </w:t>
-      </w:r>
-      <w:r>
-        <w:rPr>
-          <w:rFonts w:asciiTheme="minorEastAsia" w:hAnsiTheme="minorEastAsia"/>
-          <w:b/>
-          <w:lang w:val="en-US"/>
-        </w:rPr>
-        <w:t>business plan</w:t>
-      </w:r>
-      <w:r>
-        <w:rPr>
-          <w:rFonts w:asciiTheme="minorEastAsia" w:hAnsiTheme="minorEastAsia"/>
-          <w:lang w:val="en-US"/>
-        </w:rPr>
-        <w:t xml:space="preserve">. They stated that this part was especially difficult for them. We are grateful for this recommendation and will consider this perspective in our brainstorming when searching for an idea on our own. Switching the point of view from the developer’s side to the customer’s side, or the business side, </w:t>
-      </w:r>
-      <w:r>
-        <w:rPr>
-          <w:rFonts w:asciiTheme="minorEastAsia" w:hAnsiTheme="minorEastAsia"/>
-          <w:lang w:val="en-US"/>
-        </w:rPr>
-        <w:t>can be challenging for people with a technical background, but we think it is crucial when making a meaningful project.</w:t>
-      </w:r>
-    </w:p>
-    <w:p>
-      <w:pPr>
-        <w:jc w:val="both"/>
-        <w:rPr>
-          <w:rFonts w:asciiTheme="minorEastAsia" w:hAnsiTheme="minorEastAsia"/>
-          <w:lang w:val="en-US"/>
-        </w:rPr>
-      </w:pPr>
-      <w:r>
-        <w:rPr>
-          <w:rFonts w:asciiTheme="minorEastAsia" w:hAnsiTheme="minorEastAsia"/>
-          <w:lang w:val="en-US"/>
-        </w:rPr>
-        <w:t xml:space="preserve">The second recommendation of the two developers regarded </w:t>
-      </w:r>
-      <w:r>
-        <w:rPr>
-          <w:rFonts w:asciiTheme="minorEastAsia" w:hAnsiTheme="minorEastAsia"/>
-          <w:b/>
-          <w:lang w:val="en-US"/>
-        </w:rPr>
-        <w:t>time management</w:t>
-      </w:r>
-      <w:r>
-        <w:rPr>
-          <w:rFonts w:asciiTheme="minorEastAsia" w:hAnsiTheme="minorEastAsia"/>
-          <w:lang w:val="en-US"/>
-        </w:rPr>
-        <w:t xml:space="preserve">. They suggest organizing one’s time to complete the final project in due time. As a strategy, they recommend dividing the project </w:t>
-      </w:r>
-      <w:r>
-        <w:rPr>
-          <w:rFonts w:asciiTheme="minorEastAsia" w:hAnsiTheme="minorEastAsia"/>
-          <w:lang w:val="en-US"/>
-        </w:rPr>
-        <w:t>into</w:t>
-      </w:r>
-      <w:r>
-        <w:rPr>
-          <w:rFonts w:asciiTheme="minorEastAsia" w:hAnsiTheme="minorEastAsia"/>
-          <w:lang w:val="en-US"/>
-        </w:rPr>
-        <w:t xml:space="preserve"> small targets, and setting deadlines for each of them. </w:t>
-      </w:r>
-      <w:r>
-        <w:rPr>
-          <w:rFonts w:asciiTheme="minorEastAsia" w:hAnsiTheme="minorEastAsia"/>
-          <w:lang w:val="en-US"/>
-        </w:rPr>
-        <w:t xml:space="preserve">We are grateful for this tip, and we will emphasize good time management for our own project planning. We will aim to work continuously on the project so that work does not pile up right before a deadline. </w:t>
-      </w:r>
-    </w:p>
-    <w:p>
-      <w:pPr>
-        <w:jc w:val="both"/>
-        <w:rPr>
-          <w:rFonts w:asciiTheme="minorEastAsia" w:hAnsiTheme="minorEastAsia"/>
-          <w:lang w:val="en-US"/>
-        </w:rPr>
-      </w:pPr>
-      <w:r>
-        <w:rPr>
-          <w:rFonts w:asciiTheme="minorEastAsia" w:hAnsiTheme="minorEastAsia"/>
-          <w:lang w:val="en-US"/>
-        </w:rPr>
-        <w:t xml:space="preserve">We </w:t>
-      </w:r>
-      <w:r>
-        <w:rPr>
-          <w:rFonts w:asciiTheme="minorEastAsia" w:hAnsiTheme="minorEastAsia"/>
-          <w:lang w:val="en-US"/>
-        </w:rPr>
-        <w:t xml:space="preserve">are thankful for the valuable insights provided by Amedeo and Thierry from the </w:t>
-      </w:r>
-      <w:r>
-        <w:rPr>
-          <w:rFonts w:asciiTheme="minorEastAsia" w:hAnsiTheme="minorEastAsia"/>
-          <w:lang w:val="en-US"/>
-        </w:rPr>
-        <w:t>“</w:t>
-      </w:r>
-      <w:proofErr w:type="spellStart"/>
-      <w:r>
-        <w:rPr>
-          <w:rFonts w:asciiTheme="minorEastAsia" w:hAnsiTheme="minorEastAsia"/>
-          <w:lang w:val="en-US"/>
-        </w:rPr>
-        <w:t>XianZai</w:t>
-      </w:r>
-      <w:proofErr w:type="spellEnd"/>
-      <w:r>
-        <w:rPr>
-          <w:rFonts w:asciiTheme="minorEastAsia" w:hAnsiTheme="minorEastAsia"/>
-          <w:lang w:val="en-US"/>
-        </w:rPr>
-        <w:t>”</w:t>
-      </w:r>
-      <w:r>
-        <w:rPr>
-          <w:rFonts w:asciiTheme="minorEastAsia" w:hAnsiTheme="minorEastAsia"/>
-          <w:lang w:val="en-US"/>
-        </w:rPr>
-        <w:t xml:space="preserve"> project and we are excited for our own project in this course.</w:t>
-      </w:r>
+          <w:lang w:val="en-US"/>
+        </w:rPr>
+      </w:pPr>
     </w:p>
     <w:sectPr>
-      <w:headerReference w:type="default" r:id="rId16"/>
+      <w:headerReference w:type="default" r:id="rId13"/>
       <w:pgSz w:w="11906" w:h="16838"/>
       <w:pgMar w:top="1417" w:right="1417" w:bottom="1134" w:left="1417" w:header="708" w:footer="708" w:gutter="0"/>
       <w:cols w:space="708"/>
@@ -2178,11 +2862,235 @@
 <file path=word/numbering.xml><?xml version="1.0" encoding="utf-8"?>
 <w:numbering xmlns:wpc="http://schemas.microsoft.com/office/word/2010/wordprocessingCanvas" xmlns:cx="http://schemas.microsoft.com/office/drawing/2014/chartex" xmlns:cx1="http://schemas.microsoft.com/office/drawing/2015/9/8/chartex" xmlns:cx2="http://schemas.microsoft.com/office/drawing/2015/10/21/chartex" xmlns:cx3="http://schemas.microsoft.com/office/drawing/2016/5/9/chartex" xmlns:cx4="http://schemas.microsoft.com/office/drawing/2016/5/10/chartex" xmlns:cx5="http://schemas.microsoft.com/office/drawing/2016/5/11/chartex" xmlns:cx6="http://schemas.microsoft.com/office/drawing/2016/5/12/chartex" xmlns:cx7="http://schemas.microsoft.com/office/drawing/2016/5/13/chartex" xmlns:cx8="http://schemas.microsoft.com/office/drawing/2016/5/14/chartex" xmlns:mc="http://schemas.openxmlformats.org/markup-compatibility/2006" xmlns:aink="http://schemas.microsoft.com/office/drawing/2016/ink" xmlns:am3d="http://schemas.microsoft.com/office/drawing/2017/model3d" xmlns:o="urn:schemas-microsoft-com:office:office" xmlns:oel="http://schemas.microsoft.com/office/2019/extlst" xmlns:r="http://schemas.openxmlformats.org/officeDocument/2006/relationships" xmlns:m="http://schemas.openxmlformats.org/officeDocument/2006/math" xmlns:v="urn:schemas-microsoft-com:vml" xmlns:wp14="http://schemas.microsoft.com/office/word/2010/wordprocessingDrawing" xmlns:wp="http://schemas.openxmlformats.org/drawingml/2006/wordprocessingDrawing" xmlns:w10="urn:schemas-microsoft-com:office:word" xmlns:w="http://schemas.openxmlformats.org/wordprocessingml/2006/main" xmlns:w14="http://schemas.microsoft.com/office/word/2010/wordml" xmlns:w15="http://schemas.microsoft.com/office/word/2012/wordml" xmlns:w16cex="http://schemas.microsoft.com/office/word/2018/wordml/cex" xmlns:w16cid="http://schemas.microsoft.com/office/word/2016/wordml/cid" xmlns:w16="http://schemas.microsoft.com/office/word/2018/wordml" xmlns:w16du="http://schemas.microsoft.com/office/word/2023/wordml/word16du" xmlns:w16sdtdh="http://schemas.microsoft.com/office/word/2020/wordml/sdtdatahash" xmlns:w16sdtfl="http://schemas.microsoft.com/office/word/2024/wordml/sdtformatlock" xmlns:w16se="http://schemas.microsoft.com/office/word/2015/wordml/symex" xmlns:wpg="http://schemas.microsoft.com/office/word/2010/wordprocessingGroup" xmlns:wpi="http://schemas.microsoft.com/office/word/2010/wordprocessingInk" xmlns:wne="http://schemas.microsoft.com/office/word/2006/wordml" xmlns:wps="http://schemas.microsoft.com/office/word/2010/wordprocessingShape" mc:Ignorable="w14 w15 w16se w16cid w16 w16cex w16sdtdh w16sdtfl w16du wp14">
   <w:abstractNum w:abstractNumId="0" w15:restartNumberingAfterBreak="0">
+    <w:nsid w:val="552F39D4"/>
+    <w:multiLevelType w:val="hybridMultilevel"/>
+    <w:tmpl w:val="5256231A"/>
+    <w:lvl w:ilvl="0" w:tplc="E3C47D10">
+      <w:numFmt w:val="bullet"/>
+      <w:lvlText w:val="-"/>
+      <w:lvlJc w:val="left"/>
+      <w:pPr>
+        <w:ind w:left="360" w:hanging="360"/>
+      </w:pPr>
+      <w:rPr>
+        <w:rFonts w:ascii="DengXian" w:eastAsia="DengXian" w:hAnsi="DengXian" w:cstheme="minorBidi" w:hint="eastAsia"/>
+      </w:rPr>
+    </w:lvl>
+    <w:lvl w:ilvl="1" w:tplc="04070003" w:tentative="1">
+      <w:start w:val="1"/>
+      <w:numFmt w:val="bullet"/>
+      <w:lvlText w:val="o"/>
+      <w:lvlJc w:val="left"/>
+      <w:pPr>
+        <w:ind w:left="1080" w:hanging="360"/>
+      </w:pPr>
+      <w:rPr>
+        <w:rFonts w:ascii="Courier New" w:hAnsi="Courier New" w:cs="Courier New" w:hint="default"/>
+      </w:rPr>
+    </w:lvl>
+    <w:lvl w:ilvl="2" w:tplc="04070005" w:tentative="1">
+      <w:start w:val="1"/>
+      <w:numFmt w:val="bullet"/>
+      <w:lvlText w:val=""/>
+      <w:lvlJc w:val="left"/>
+      <w:pPr>
+        <w:ind w:left="1800" w:hanging="360"/>
+      </w:pPr>
+      <w:rPr>
+        <w:rFonts w:ascii="Wingdings" w:hAnsi="Wingdings" w:hint="default"/>
+      </w:rPr>
+    </w:lvl>
+    <w:lvl w:ilvl="3" w:tplc="04070001" w:tentative="1">
+      <w:start w:val="1"/>
+      <w:numFmt w:val="bullet"/>
+      <w:lvlText w:val=""/>
+      <w:lvlJc w:val="left"/>
+      <w:pPr>
+        <w:ind w:left="2520" w:hanging="360"/>
+      </w:pPr>
+      <w:rPr>
+        <w:rFonts w:ascii="Symbol" w:hAnsi="Symbol" w:hint="default"/>
+      </w:rPr>
+    </w:lvl>
+    <w:lvl w:ilvl="4" w:tplc="04070003" w:tentative="1">
+      <w:start w:val="1"/>
+      <w:numFmt w:val="bullet"/>
+      <w:lvlText w:val="o"/>
+      <w:lvlJc w:val="left"/>
+      <w:pPr>
+        <w:ind w:left="3240" w:hanging="360"/>
+      </w:pPr>
+      <w:rPr>
+        <w:rFonts w:ascii="Courier New" w:hAnsi="Courier New" w:cs="Courier New" w:hint="default"/>
+      </w:rPr>
+    </w:lvl>
+    <w:lvl w:ilvl="5" w:tplc="04070005" w:tentative="1">
+      <w:start w:val="1"/>
+      <w:numFmt w:val="bullet"/>
+      <w:lvlText w:val=""/>
+      <w:lvlJc w:val="left"/>
+      <w:pPr>
+        <w:ind w:left="3960" w:hanging="360"/>
+      </w:pPr>
+      <w:rPr>
+        <w:rFonts w:ascii="Wingdings" w:hAnsi="Wingdings" w:hint="default"/>
+      </w:rPr>
+    </w:lvl>
+    <w:lvl w:ilvl="6" w:tplc="04070001" w:tentative="1">
+      <w:start w:val="1"/>
+      <w:numFmt w:val="bullet"/>
+      <w:lvlText w:val=""/>
+      <w:lvlJc w:val="left"/>
+      <w:pPr>
+        <w:ind w:left="4680" w:hanging="360"/>
+      </w:pPr>
+      <w:rPr>
+        <w:rFonts w:ascii="Symbol" w:hAnsi="Symbol" w:hint="default"/>
+      </w:rPr>
+    </w:lvl>
+    <w:lvl w:ilvl="7" w:tplc="04070003" w:tentative="1">
+      <w:start w:val="1"/>
+      <w:numFmt w:val="bullet"/>
+      <w:lvlText w:val="o"/>
+      <w:lvlJc w:val="left"/>
+      <w:pPr>
+        <w:ind w:left="5400" w:hanging="360"/>
+      </w:pPr>
+      <w:rPr>
+        <w:rFonts w:ascii="Courier New" w:hAnsi="Courier New" w:cs="Courier New" w:hint="default"/>
+      </w:rPr>
+    </w:lvl>
+    <w:lvl w:ilvl="8" w:tplc="04070005" w:tentative="1">
+      <w:start w:val="1"/>
+      <w:numFmt w:val="bullet"/>
+      <w:lvlText w:val=""/>
+      <w:lvlJc w:val="left"/>
+      <w:pPr>
+        <w:ind w:left="6120" w:hanging="360"/>
+      </w:pPr>
+      <w:rPr>
+        <w:rFonts w:ascii="Wingdings" w:hAnsi="Wingdings" w:hint="default"/>
+      </w:rPr>
+    </w:lvl>
+  </w:abstractNum>
+  <w:abstractNum w:abstractNumId="1" w15:restartNumberingAfterBreak="0">
+    <w:nsid w:val="5F3B1AEE"/>
+    <w:multiLevelType w:val="hybridMultilevel"/>
+    <w:tmpl w:val="0B3073D0"/>
+    <w:lvl w:ilvl="0" w:tplc="BAFA9C62">
+      <w:numFmt w:val="bullet"/>
+      <w:lvlText w:val="-"/>
+      <w:lvlJc w:val="left"/>
+      <w:pPr>
+        <w:ind w:left="360" w:hanging="360"/>
+      </w:pPr>
+      <w:rPr>
+        <w:rFonts w:ascii="DengXian" w:eastAsia="DengXian" w:hAnsi="DengXian" w:cstheme="minorBidi" w:hint="eastAsia"/>
+      </w:rPr>
+    </w:lvl>
+    <w:lvl w:ilvl="1" w:tplc="04070003" w:tentative="1">
+      <w:start w:val="1"/>
+      <w:numFmt w:val="bullet"/>
+      <w:lvlText w:val="o"/>
+      <w:lvlJc w:val="left"/>
+      <w:pPr>
+        <w:ind w:left="1080" w:hanging="360"/>
+      </w:pPr>
+      <w:rPr>
+        <w:rFonts w:ascii="Courier New" w:hAnsi="Courier New" w:cs="Courier New" w:hint="default"/>
+      </w:rPr>
+    </w:lvl>
+    <w:lvl w:ilvl="2" w:tplc="04070005" w:tentative="1">
+      <w:start w:val="1"/>
+      <w:numFmt w:val="bullet"/>
+      <w:lvlText w:val=""/>
+      <w:lvlJc w:val="left"/>
+      <w:pPr>
+        <w:ind w:left="1800" w:hanging="360"/>
+      </w:pPr>
+      <w:rPr>
+        <w:rFonts w:ascii="Wingdings" w:hAnsi="Wingdings" w:hint="default"/>
+      </w:rPr>
+    </w:lvl>
+    <w:lvl w:ilvl="3" w:tplc="04070001" w:tentative="1">
+      <w:start w:val="1"/>
+      <w:numFmt w:val="bullet"/>
+      <w:lvlText w:val=""/>
+      <w:lvlJc w:val="left"/>
+      <w:pPr>
+        <w:ind w:left="2520" w:hanging="360"/>
+      </w:pPr>
+      <w:rPr>
+        <w:rFonts w:ascii="Symbol" w:hAnsi="Symbol" w:hint="default"/>
+      </w:rPr>
+    </w:lvl>
+    <w:lvl w:ilvl="4" w:tplc="04070003" w:tentative="1">
+      <w:start w:val="1"/>
+      <w:numFmt w:val="bullet"/>
+      <w:lvlText w:val="o"/>
+      <w:lvlJc w:val="left"/>
+      <w:pPr>
+        <w:ind w:left="3240" w:hanging="360"/>
+      </w:pPr>
+      <w:rPr>
+        <w:rFonts w:ascii="Courier New" w:hAnsi="Courier New" w:cs="Courier New" w:hint="default"/>
+      </w:rPr>
+    </w:lvl>
+    <w:lvl w:ilvl="5" w:tplc="04070005" w:tentative="1">
+      <w:start w:val="1"/>
+      <w:numFmt w:val="bullet"/>
+      <w:lvlText w:val=""/>
+      <w:lvlJc w:val="left"/>
+      <w:pPr>
+        <w:ind w:left="3960" w:hanging="360"/>
+      </w:pPr>
+      <w:rPr>
+        <w:rFonts w:ascii="Wingdings" w:hAnsi="Wingdings" w:hint="default"/>
+      </w:rPr>
+    </w:lvl>
+    <w:lvl w:ilvl="6" w:tplc="04070001" w:tentative="1">
+      <w:start w:val="1"/>
+      <w:numFmt w:val="bullet"/>
+      <w:lvlText w:val=""/>
+      <w:lvlJc w:val="left"/>
+      <w:pPr>
+        <w:ind w:left="4680" w:hanging="360"/>
+      </w:pPr>
+      <w:rPr>
+        <w:rFonts w:ascii="Symbol" w:hAnsi="Symbol" w:hint="default"/>
+      </w:rPr>
+    </w:lvl>
+    <w:lvl w:ilvl="7" w:tplc="04070003" w:tentative="1">
+      <w:start w:val="1"/>
+      <w:numFmt w:val="bullet"/>
+      <w:lvlText w:val="o"/>
+      <w:lvlJc w:val="left"/>
+      <w:pPr>
+        <w:ind w:left="5400" w:hanging="360"/>
+      </w:pPr>
+      <w:rPr>
+        <w:rFonts w:ascii="Courier New" w:hAnsi="Courier New" w:cs="Courier New" w:hint="default"/>
+      </w:rPr>
+    </w:lvl>
+    <w:lvl w:ilvl="8" w:tplc="04070005" w:tentative="1">
+      <w:start w:val="1"/>
+      <w:numFmt w:val="bullet"/>
+      <w:lvlText w:val=""/>
+      <w:lvlJc w:val="left"/>
+      <w:pPr>
+        <w:ind w:left="6120" w:hanging="360"/>
+      </w:pPr>
+      <w:rPr>
+        <w:rFonts w:ascii="Wingdings" w:hAnsi="Wingdings" w:hint="default"/>
+      </w:rPr>
+    </w:lvl>
+  </w:abstractNum>
+  <w:abstractNum w:abstractNumId="2" w15:restartNumberingAfterBreak="0">
     <w:nsid w:val="6FD34009"/>
     <w:multiLevelType w:val="hybridMultilevel"/>
-    <w:tmpl w:val="E0023A30"/>
-    <w:lvl w:ilvl="0" w:tplc="EF9834FE">
-      <w:start w:val="2"/>
+    <w:tmpl w:val="8200CE56"/>
+    <w:lvl w:ilvl="0" w:tplc="8DF091B2">
+      <w:start w:val="1"/>
       <w:numFmt w:val="decimal"/>
       <w:lvlText w:val="%1."/>
       <w:lvlJc w:val="left"/>
@@ -2270,7 +3178,13 @@
     </w:lvl>
   </w:abstractNum>
   <w:num w:numId="1" w16cid:durableId="18941212">
+    <w:abstractNumId w:val="2"/>
+  </w:num>
+  <w:num w:numId="2" w16cid:durableId="1024476043">
     <w:abstractNumId w:val="0"/>
+  </w:num>
+  <w:num w:numId="3" w16cid:durableId="1955357821">
+    <w:abstractNumId w:val="1"/>
   </w:num>
 </w:numbering>
 </file>
@@ -2878,7 +3792,6 @@
   <w:style w:type="character" w:default="1" w:styleId="Absatz-Standardschriftart">
     <w:name w:val="Default Paragraph Font"/>
     <w:uiPriority w:val="1"/>
-    <w:semiHidden/>
     <w:unhideWhenUsed/>
   </w:style>
   <w:style w:type="table" w:default="1" w:styleId="NormaleTabelle">

</xml_diff>

<commit_message>
Feature / added to report
</commit_message>
<xml_diff>
--- a/report/Group_Assignment_2_2559273_2559274.docx
+++ b/report/Group_Assignment_2_2559273_2559274.docx
@@ -778,13 +778,15 @@
         </w:rPr>
         <w:t xml:space="preserve">The project repository is available under the following link: </w:t>
       </w:r>
-      <w:r>
-        <w:rPr>
-          <w:rFonts w:asciiTheme="minorEastAsia" w:hAnsiTheme="minorEastAsia"/>
-          <w:lang w:val="en-US"/>
-        </w:rPr>
-        <w:br/>
-      </w:r>
+    </w:p>
+    <w:p>
+      <w:pPr>
+        <w:jc w:val="both"/>
+        <w:rPr>
+          <w:rFonts w:asciiTheme="minorEastAsia" w:hAnsiTheme="minorEastAsia"/>
+          <w:lang w:val="en-US"/>
+        </w:rPr>
+      </w:pPr>
       <w:hyperlink r:id="rId12" w:history="1">
         <w:r>
           <w:rPr>
@@ -1053,6 +1055,21 @@
       <w:r>
         <w:rPr>
           <w:rFonts w:asciiTheme="minorEastAsia" w:hAnsiTheme="minorEastAsia"/>
+          <w:i/>
+          <w:lang w:val="en-US"/>
+        </w:rPr>
+        <w:t>Philipp:</w:t>
+      </w:r>
+      <w:r>
+        <w:rPr>
+          <w:rFonts w:asciiTheme="minorEastAsia" w:hAnsiTheme="minorEastAsia"/>
+          <w:lang w:val="en-US"/>
+        </w:rPr>
+        <w:t xml:space="preserve"> </w:t>
+      </w:r>
+      <w:r>
+        <w:rPr>
+          <w:rFonts w:asciiTheme="minorEastAsia" w:hAnsiTheme="minorEastAsia"/>
           <w:lang w:val="en-US"/>
         </w:rPr>
         <w:t>Pascal took the initiative and started the project by implementing the</w:t>
@@ -1085,13 +1102,88 @@
         </w:rPr>
         <w:t xml:space="preserve"> The task missing was implementing the UI and some refactoring, which I did, because there was nothing else open to do. I didn’t care but specifying and allocating the tasks at the beginning would make the process </w:t>
       </w:r>
+      <w:r>
+        <w:rPr>
+          <w:rFonts w:asciiTheme="minorEastAsia" w:hAnsiTheme="minorEastAsia"/>
+          <w:lang w:val="en-US"/>
+        </w:rPr>
+        <w:t>clearer</w:t>
+      </w:r>
+      <w:r>
+        <w:rPr>
+          <w:rFonts w:asciiTheme="minorEastAsia" w:hAnsiTheme="minorEastAsia"/>
+          <w:lang w:val="en-US"/>
+        </w:rPr>
+        <w:t>.</w:t>
+      </w:r>
+    </w:p>
+    <w:p>
+      <w:pPr>
+        <w:jc w:val="both"/>
+        <w:rPr>
+          <w:rFonts w:asciiTheme="minorEastAsia" w:hAnsiTheme="minorEastAsia"/>
+          <w:lang w:val="en-US"/>
+        </w:rPr>
+      </w:pPr>
+      <w:r>
+        <w:rPr>
+          <w:rFonts w:asciiTheme="minorEastAsia" w:hAnsiTheme="minorEastAsia"/>
+          <w:i/>
+          <w:lang w:val="en-US"/>
+        </w:rPr>
+        <w:t>Pascal:</w:t>
+      </w:r>
+      <w:r>
+        <w:rPr>
+          <w:rFonts w:asciiTheme="minorEastAsia" w:hAnsiTheme="minorEastAsia"/>
+          <w:i/>
+          <w:lang w:val="en-US"/>
+        </w:rPr>
+        <w:t xml:space="preserve"> </w:t>
+      </w:r>
+      <w:r>
+        <w:rPr>
+          <w:rFonts w:asciiTheme="minorEastAsia" w:hAnsiTheme="minorEastAsia"/>
+          <w:lang w:val="en-US"/>
+        </w:rPr>
+        <w:t xml:space="preserve">I was taking the first steps, creating the repository and adding basic functionality. Philipp later implemented the UI, which fitted well to the components I was coding earlier. This is great because it means we worked as a good team, where one developer understands and uses the code of another developer. He also used GitHub pull requests to synchronize his changes with the previous state which, I find, is a good and sustainable workflow. When I reviewed his request, I saw some inconsistencies regarding responsibilities of classes and some missing documentation. I wish he had considered writing more extensive documentation to ease the process of code reviewing. After </w:t>
+      </w:r>
+      <w:r>
+        <w:rPr>
+          <w:rFonts w:asciiTheme="minorEastAsia" w:hAnsiTheme="minorEastAsia"/>
+          <w:lang w:val="en-US"/>
+        </w:rPr>
+        <w:t xml:space="preserve">some refactoring </w:t>
+      </w:r>
+      <w:r>
+        <w:rPr>
+          <w:rFonts w:asciiTheme="minorEastAsia" w:hAnsiTheme="minorEastAsia"/>
+          <w:lang w:val="en-US"/>
+        </w:rPr>
+        <w:t xml:space="preserve">I </w:t>
+      </w:r>
+      <w:r>
+        <w:rPr>
+          <w:rFonts w:asciiTheme="minorEastAsia" w:hAnsiTheme="minorEastAsia"/>
+          <w:lang w:val="en-US"/>
+        </w:rPr>
+        <w:t>merged his changes</w:t>
+      </w:r>
+      <w:r>
+        <w:rPr>
+          <w:rFonts w:asciiTheme="minorEastAsia" w:hAnsiTheme="minorEastAsia"/>
+          <w:lang w:val="en-US"/>
+        </w:rPr>
+        <w:t xml:space="preserve"> into </w:t>
+      </w:r>
       <w:proofErr w:type="gramStart"/>
       <w:r>
         <w:rPr>
           <w:rFonts w:asciiTheme="minorEastAsia" w:hAnsiTheme="minorEastAsia"/>
-          <w:lang w:val="en-US"/>
-        </w:rPr>
-        <w:t>more clear</w:t>
+          <w:i/>
+          <w:lang w:val="en-US"/>
+        </w:rPr>
+        <w:t>main</w:t>
       </w:r>
       <w:proofErr w:type="gramEnd"/>
       <w:r>
@@ -1099,7 +1191,7 @@
           <w:rFonts w:asciiTheme="minorEastAsia" w:hAnsiTheme="minorEastAsia"/>
           <w:lang w:val="en-US"/>
         </w:rPr>
-        <w:t>.</w:t>
+        <w:t xml:space="preserve"> and the main implementation of the project was finished.</w:t>
       </w:r>
     </w:p>
     <w:p>
@@ -1738,6 +1830,7 @@
                 <w:szCs w:val="20"/>
                 <w:lang w:val="en-US"/>
               </w:rPr>
+              <w:lastRenderedPageBreak/>
               <w:t>Design Spec (</w:t>
             </w:r>
             <w:r>
@@ -2321,7 +2414,6 @@
                 <w:szCs w:val="20"/>
                 <w:lang w:val="en-US"/>
               </w:rPr>
-              <w:lastRenderedPageBreak/>
               <w:t>Code Review</w:t>
             </w:r>
           </w:p>

</xml_diff>